<commit_message>
Sonarcube integration with python
</commit_message>
<xml_diff>
--- a/Session-24/Sonarcube Installation.docx
+++ b/Session-24/Sonarcube Installation.docx
@@ -11,21 +11,12 @@
           <w:lang w:val="en-US"/>
         </w:rPr>
       </w:pPr>
-      <w:proofErr w:type="spellStart"/>
-      <w:r>
-        <w:rPr>
-          <w:b/>
-          <w:lang w:val="en-US"/>
-        </w:rPr>
-        <w:t>SonarCube</w:t>
-      </w:r>
-      <w:proofErr w:type="spellEnd"/>
-      <w:r>
-        <w:rPr>
-          <w:b/>
-          <w:lang w:val="en-US"/>
-        </w:rPr>
-        <w:t xml:space="preserve"> Installation</w:t>
+      <w:r>
+        <w:rPr>
+          <w:b/>
+          <w:lang w:val="en-US"/>
+        </w:rPr>
+        <w:t>SonarCube Installation</w:t>
       </w:r>
     </w:p>
     <w:p>
@@ -979,7 +970,6 @@
           <w:lang w:val="en-US"/>
         </w:rPr>
       </w:pPr>
-      <w:bookmarkStart w:id="0" w:name="_GoBack"/>
       <w:r>
         <w:rPr>
           <w:noProof/>
@@ -1029,16 +1019,3387 @@
           </wp:inline>
         </w:drawing>
       </w:r>
+    </w:p>
+    <w:p>
+      <w:pPr>
+        <w:rPr>
+          <w:b/>
+          <w:color w:val="000000" w:themeColor="text1"/>
+          <w:lang w:val="en-US"/>
+        </w:rPr>
+      </w:pPr>
+    </w:p>
+    <w:p>
+      <w:pPr>
+        <w:rPr>
+          <w:b/>
+          <w:color w:val="000000" w:themeColor="text1"/>
+          <w:lang w:val="en-US"/>
+        </w:rPr>
+      </w:pPr>
+      <w:r>
+        <w:rPr>
+          <w:b/>
+          <w:color w:val="000000" w:themeColor="text1"/>
+          <w:lang w:val="en-US"/>
+        </w:rPr>
+        <w:t>Save the token at safe place</w:t>
+      </w:r>
+      <w:r>
+        <w:rPr>
+          <w:b/>
+          <w:color w:val="000000" w:themeColor="text1"/>
+          <w:lang w:val="en-US"/>
+        </w:rPr>
+        <w:t>:</w:t>
+      </w:r>
+    </w:p>
+    <w:p>
+      <w:pPr>
+        <w:pStyle w:val="Heading2"/>
+        <w:jc w:val="center"/>
+        <w:rPr>
+          <w:sz w:val="28"/>
+          <w:lang w:val="en-US"/>
+        </w:rPr>
+      </w:pPr>
+    </w:p>
+    <w:p>
+      <w:pPr>
+        <w:pStyle w:val="Heading1"/>
+        <w:jc w:val="center"/>
+        <w:rPr>
+          <w:lang w:val="en-US"/>
+        </w:rPr>
+      </w:pPr>
+      <w:r>
+        <w:rPr>
+          <w:lang w:val="en-US"/>
+        </w:rPr>
+        <w:t>SONARQUBE CLI</w:t>
+      </w:r>
+    </w:p>
+    <w:p>
+      <w:pPr>
+        <w:rPr>
+          <w:lang w:val="en-US"/>
+        </w:rPr>
+      </w:pPr>
+      <w:r>
+        <w:rPr>
+          <w:lang w:val="en-US"/>
+        </w:rPr>
+        <w:t xml:space="preserve">Link: </w:t>
+      </w:r>
+      <w:r>
+        <w:rPr>
+          <w:lang w:val="en-US"/>
+        </w:rPr>
+        <w:t>https://docs.sonarsource.com/sonarqube-server/10.8/analyzing-source-code/scanners/sonarscanner/</w:t>
+      </w:r>
+    </w:p>
+    <w:p>
+      <w:pPr>
+        <w:rPr>
+          <w:b/>
+          <w:color w:val="000000" w:themeColor="text1"/>
+          <w:lang w:val="en-US"/>
+        </w:rPr>
+      </w:pPr>
+      <w:r>
+        <w:rPr>
+          <w:noProof/>
+          <w:lang w:eastAsia="en-IN"/>
+        </w:rPr>
+        <w:drawing>
+          <wp:inline distT="0" distB="0" distL="0" distR="0" wp14:anchorId="05370693" wp14:editId="742C6C4E">
+            <wp:extent cx="5731510" cy="2466975"/>
+            <wp:effectExtent l="0" t="0" r="2540" b="9525"/>
+            <wp:docPr id="11" name="Picture 11"/>
+            <wp:cNvGraphicFramePr>
+              <a:graphicFrameLocks xmlns:a="http://schemas.openxmlformats.org/drawingml/2006/main" noChangeAspect="1"/>
+            </wp:cNvGraphicFramePr>
+            <a:graphic xmlns:a="http://schemas.openxmlformats.org/drawingml/2006/main">
+              <a:graphicData uri="http://schemas.openxmlformats.org/drawingml/2006/picture">
+                <pic:pic xmlns:pic="http://schemas.openxmlformats.org/drawingml/2006/picture">
+                  <pic:nvPicPr>
+                    <pic:cNvPr id="1" name=""/>
+                    <pic:cNvPicPr/>
+                  </pic:nvPicPr>
+                  <pic:blipFill rotWithShape="1">
+                    <a:blip r:embed="rId15"/>
+                    <a:srcRect t="5320" b="18129"/>
+                    <a:stretch/>
+                  </pic:blipFill>
+                  <pic:spPr bwMode="auto">
+                    <a:xfrm>
+                      <a:off x="0" y="0"/>
+                      <a:ext cx="5731510" cy="2466975"/>
+                    </a:xfrm>
+                    <a:prstGeom prst="rect">
+                      <a:avLst/>
+                    </a:prstGeom>
+                    <a:ln>
+                      <a:noFill/>
+                    </a:ln>
+                    <a:extLst>
+                      <a:ext uri="{53640926-AAD7-44D8-BBD7-CCE9431645EC}">
+                        <a14:shadowObscured xmlns:a14="http://schemas.microsoft.com/office/drawing/2010/main"/>
+                      </a:ext>
+                    </a:extLst>
+                  </pic:spPr>
+                </pic:pic>
+              </a:graphicData>
+            </a:graphic>
+          </wp:inline>
+        </w:drawing>
+      </w:r>
+    </w:p>
+    <w:p>
+      <w:pPr>
+        <w:rPr>
+          <w:b/>
+          <w:color w:val="000000" w:themeColor="text1"/>
+          <w:lang w:val="en-US"/>
+        </w:rPr>
+      </w:pPr>
+    </w:p>
+    <w:p>
+      <w:pPr>
+        <w:rPr>
+          <w:b/>
+          <w:color w:val="000000" w:themeColor="text1"/>
+          <w:lang w:val="en-US"/>
+        </w:rPr>
+      </w:pPr>
+      <w:r>
+        <w:rPr>
+          <w:b/>
+          <w:color w:val="000000" w:themeColor="text1"/>
+          <w:lang w:val="en-US"/>
+        </w:rPr>
+        <w:t xml:space="preserve">Extract it to the </w:t>
+      </w:r>
+      <w:proofErr w:type="gramStart"/>
+      <w:r>
+        <w:rPr>
+          <w:b/>
+          <w:color w:val="000000" w:themeColor="text1"/>
+          <w:lang w:val="en-US"/>
+        </w:rPr>
+        <w:t>c:drive</w:t>
+      </w:r>
+      <w:proofErr w:type="gramEnd"/>
+      <w:r>
+        <w:rPr>
+          <w:b/>
+          <w:color w:val="000000" w:themeColor="text1"/>
+          <w:lang w:val="en-US"/>
+        </w:rPr>
+        <w:t>&gt; and add its path to environment variables</w:t>
+      </w:r>
+    </w:p>
+    <w:p>
+      <w:pPr>
+        <w:rPr>
+          <w:b/>
+          <w:color w:val="000000" w:themeColor="text1"/>
+          <w:lang w:val="en-US"/>
+        </w:rPr>
+      </w:pPr>
+      <w:r>
+        <w:rPr>
+          <w:noProof/>
+          <w:lang w:eastAsia="en-IN"/>
+        </w:rPr>
+        <w:lastRenderedPageBreak/>
+        <w:drawing>
+          <wp:inline distT="0" distB="0" distL="0" distR="0" wp14:anchorId="243BE63D" wp14:editId="31CB6683">
+            <wp:extent cx="2961877" cy="3482975"/>
+            <wp:effectExtent l="0" t="0" r="0" b="3175"/>
+            <wp:docPr id="12" name="Picture 12"/>
+            <wp:cNvGraphicFramePr>
+              <a:graphicFrameLocks xmlns:a="http://schemas.openxmlformats.org/drawingml/2006/main" noChangeAspect="1"/>
+            </wp:cNvGraphicFramePr>
+            <a:graphic xmlns:a="http://schemas.openxmlformats.org/drawingml/2006/main">
+              <a:graphicData uri="http://schemas.openxmlformats.org/drawingml/2006/picture">
+                <pic:pic xmlns:pic="http://schemas.openxmlformats.org/drawingml/2006/picture">
+                  <pic:nvPicPr>
+                    <pic:cNvPr id="1" name=""/>
+                    <pic:cNvPicPr/>
+                  </pic:nvPicPr>
+                  <pic:blipFill rotWithShape="1">
+                    <a:blip r:embed="rId16"/>
+                    <a:srcRect l="45888" t="18916" r="24717" b="19606"/>
+                    <a:stretch/>
+                  </pic:blipFill>
+                  <pic:spPr bwMode="auto">
+                    <a:xfrm>
+                      <a:off x="0" y="0"/>
+                      <a:ext cx="2966234" cy="3488098"/>
+                    </a:xfrm>
+                    <a:prstGeom prst="rect">
+                      <a:avLst/>
+                    </a:prstGeom>
+                    <a:ln>
+                      <a:noFill/>
+                    </a:ln>
+                    <a:extLst>
+                      <a:ext uri="{53640926-AAD7-44D8-BBD7-CCE9431645EC}">
+                        <a14:shadowObscured xmlns:a14="http://schemas.microsoft.com/office/drawing/2010/main"/>
+                      </a:ext>
+                    </a:extLst>
+                  </pic:spPr>
+                </pic:pic>
+              </a:graphicData>
+            </a:graphic>
+          </wp:inline>
+        </w:drawing>
+      </w:r>
+    </w:p>
+    <w:p>
+      <w:pPr>
+        <w:pStyle w:val="ListParagraph"/>
+        <w:numPr>
+          <w:ilvl w:val="0"/>
+          <w:numId w:val="2"/>
+        </w:numPr>
+        <w:rPr>
+          <w:b/>
+          <w:color w:val="000000" w:themeColor="text1"/>
+          <w:lang w:val="en-US"/>
+        </w:rPr>
+      </w:pPr>
+      <w:r>
+        <w:rPr>
+          <w:b/>
+          <w:color w:val="000000" w:themeColor="text1"/>
+          <w:lang w:val="en-US"/>
+        </w:rPr>
+        <w:t>Click new &gt; add path to bin folder</w:t>
+      </w:r>
+    </w:p>
+    <w:p>
+      <w:pPr>
+        <w:rPr>
+          <w:b/>
+          <w:color w:val="000000" w:themeColor="text1"/>
+          <w:lang w:val="en-US"/>
+        </w:rPr>
+      </w:pPr>
+      <w:r>
+        <w:rPr>
+          <w:noProof/>
+          <w:lang w:eastAsia="en-IN"/>
+        </w:rPr>
+        <w:drawing>
+          <wp:inline distT="0" distB="0" distL="0" distR="0" wp14:anchorId="0733D518" wp14:editId="47CBD882">
+            <wp:extent cx="3171825" cy="2971235"/>
+            <wp:effectExtent l="0" t="0" r="0" b="635"/>
+            <wp:docPr id="13" name="Picture 13"/>
+            <wp:cNvGraphicFramePr>
+              <a:graphicFrameLocks xmlns:a="http://schemas.openxmlformats.org/drawingml/2006/main" noChangeAspect="1"/>
+            </wp:cNvGraphicFramePr>
+            <a:graphic xmlns:a="http://schemas.openxmlformats.org/drawingml/2006/main">
+              <a:graphicData uri="http://schemas.openxmlformats.org/drawingml/2006/picture">
+                <pic:pic xmlns:pic="http://schemas.openxmlformats.org/drawingml/2006/picture">
+                  <pic:nvPicPr>
+                    <pic:cNvPr id="1" name=""/>
+                    <pic:cNvPicPr/>
+                  </pic:nvPicPr>
+                  <pic:blipFill rotWithShape="1">
+                    <a:blip r:embed="rId17"/>
+                    <a:srcRect l="27421" t="8573" r="30534" b="21379"/>
+                    <a:stretch/>
+                  </pic:blipFill>
+                  <pic:spPr bwMode="auto">
+                    <a:xfrm>
+                      <a:off x="0" y="0"/>
+                      <a:ext cx="3177643" cy="2976685"/>
+                    </a:xfrm>
+                    <a:prstGeom prst="rect">
+                      <a:avLst/>
+                    </a:prstGeom>
+                    <a:ln>
+                      <a:noFill/>
+                    </a:ln>
+                    <a:extLst>
+                      <a:ext uri="{53640926-AAD7-44D8-BBD7-CCE9431645EC}">
+                        <a14:shadowObscured xmlns:a14="http://schemas.microsoft.com/office/drawing/2010/main"/>
+                      </a:ext>
+                    </a:extLst>
+                  </pic:spPr>
+                </pic:pic>
+              </a:graphicData>
+            </a:graphic>
+          </wp:inline>
+        </w:drawing>
+      </w:r>
+    </w:p>
+    <w:p>
+      <w:pPr>
+        <w:rPr>
+          <w:b/>
+          <w:color w:val="000000" w:themeColor="text1"/>
+          <w:lang w:val="en-US"/>
+        </w:rPr>
+      </w:pPr>
+      <w:proofErr w:type="spellStart"/>
+      <w:r>
+        <w:rPr>
+          <w:b/>
+          <w:color w:val="000000" w:themeColor="text1"/>
+          <w:lang w:val="en-US"/>
+        </w:rPr>
+        <w:t>Goto</w:t>
+      </w:r>
+      <w:proofErr w:type="spellEnd"/>
+      <w:r>
+        <w:rPr>
+          <w:b/>
+          <w:color w:val="000000" w:themeColor="text1"/>
+          <w:lang w:val="en-US"/>
+        </w:rPr>
+        <w:t xml:space="preserve">&gt; sonar-cube-cli folder&gt; bin&gt; </w:t>
+      </w:r>
+    </w:p>
+    <w:p>
+      <w:pPr>
+        <w:rPr>
+          <w:b/>
+          <w:color w:val="000000" w:themeColor="text1"/>
+          <w:lang w:val="en-US"/>
+        </w:rPr>
+      </w:pPr>
+      <w:r>
+        <w:rPr>
+          <w:noProof/>
+          <w:lang w:eastAsia="en-IN"/>
+        </w:rPr>
+        <w:lastRenderedPageBreak/>
+        <w:drawing>
+          <wp:inline distT="0" distB="0" distL="0" distR="0" wp14:anchorId="71D402EE" wp14:editId="20D937A2">
+            <wp:extent cx="5638800" cy="2057400"/>
+            <wp:effectExtent l="0" t="0" r="0" b="0"/>
+            <wp:docPr id="14" name="Picture 14"/>
+            <wp:cNvGraphicFramePr>
+              <a:graphicFrameLocks xmlns:a="http://schemas.openxmlformats.org/drawingml/2006/main" noChangeAspect="1"/>
+            </wp:cNvGraphicFramePr>
+            <a:graphic xmlns:a="http://schemas.openxmlformats.org/drawingml/2006/main">
+              <a:graphicData uri="http://schemas.openxmlformats.org/drawingml/2006/picture">
+                <pic:pic xmlns:pic="http://schemas.openxmlformats.org/drawingml/2006/picture">
+                  <pic:nvPicPr>
+                    <pic:cNvPr id="1" name=""/>
+                    <pic:cNvPicPr/>
+                  </pic:nvPicPr>
+                  <pic:blipFill rotWithShape="1">
+                    <a:blip r:embed="rId18"/>
+                    <a:srcRect l="831" r="786" b="36158"/>
+                    <a:stretch/>
+                  </pic:blipFill>
+                  <pic:spPr bwMode="auto">
+                    <a:xfrm>
+                      <a:off x="0" y="0"/>
+                      <a:ext cx="5638800" cy="2057400"/>
+                    </a:xfrm>
+                    <a:prstGeom prst="rect">
+                      <a:avLst/>
+                    </a:prstGeom>
+                    <a:ln>
+                      <a:noFill/>
+                    </a:ln>
+                    <a:extLst>
+                      <a:ext uri="{53640926-AAD7-44D8-BBD7-CCE9431645EC}">
+                        <a14:shadowObscured xmlns:a14="http://schemas.microsoft.com/office/drawing/2010/main"/>
+                      </a:ext>
+                    </a:extLst>
+                  </pic:spPr>
+                </pic:pic>
+              </a:graphicData>
+            </a:graphic>
+          </wp:inline>
+        </w:drawing>
+      </w:r>
+    </w:p>
+    <w:p>
+      <w:pPr>
+        <w:rPr>
+          <w:b/>
+          <w:color w:val="000000" w:themeColor="text1"/>
+          <w:lang w:val="en-US"/>
+        </w:rPr>
+      </w:pPr>
+    </w:p>
+    <w:p>
+      <w:pPr>
+        <w:rPr>
+          <w:b/>
+          <w:color w:val="000000" w:themeColor="text1"/>
+          <w:lang w:val="en-US"/>
+        </w:rPr>
+      </w:pPr>
+      <w:r>
+        <w:rPr>
+          <w:b/>
+          <w:color w:val="000000" w:themeColor="text1"/>
+          <w:lang w:val="en-US"/>
+        </w:rPr>
+        <w:t>Double click on sonar scanner and run</w:t>
+      </w:r>
+    </w:p>
+    <w:p>
+      <w:pPr>
+        <w:rPr>
+          <w:b/>
+          <w:color w:val="000000" w:themeColor="text1"/>
+          <w:lang w:val="en-US"/>
+        </w:rPr>
+      </w:pPr>
+    </w:p>
+    <w:p>
+      <w:pPr>
+        <w:rPr>
+          <w:b/>
+          <w:color w:val="000000" w:themeColor="text1"/>
+          <w:lang w:val="en-US"/>
+        </w:rPr>
+      </w:pPr>
+      <w:r>
+        <w:rPr>
+          <w:b/>
+          <w:color w:val="000000" w:themeColor="text1"/>
+          <w:lang w:val="en-US"/>
+        </w:rPr>
+        <w:t>Create python Project</w:t>
+      </w:r>
+    </w:p>
+    <w:p>
+      <w:pPr>
+        <w:rPr>
+          <w:b/>
+          <w:color w:val="000000" w:themeColor="text1"/>
+          <w:lang w:val="en-US"/>
+        </w:rPr>
+      </w:pPr>
+      <w:r>
+        <w:rPr>
+          <w:noProof/>
+          <w:lang w:eastAsia="en-IN"/>
+        </w:rPr>
+        <w:drawing>
+          <wp:inline distT="0" distB="0" distL="0" distR="0" wp14:anchorId="191A24F5" wp14:editId="21379DD4">
+            <wp:extent cx="3181350" cy="3687474"/>
+            <wp:effectExtent l="0" t="0" r="0" b="8255"/>
+            <wp:docPr id="16" name="Picture 16"/>
+            <wp:cNvGraphicFramePr>
+              <a:graphicFrameLocks xmlns:a="http://schemas.openxmlformats.org/drawingml/2006/main" noChangeAspect="1"/>
+            </wp:cNvGraphicFramePr>
+            <a:graphic xmlns:a="http://schemas.openxmlformats.org/drawingml/2006/main">
+              <a:graphicData uri="http://schemas.openxmlformats.org/drawingml/2006/picture">
+                <pic:pic xmlns:pic="http://schemas.openxmlformats.org/drawingml/2006/picture">
+                  <pic:nvPicPr>
+                    <pic:cNvPr id="1" name=""/>
+                    <pic:cNvPicPr/>
+                  </pic:nvPicPr>
+                  <pic:blipFill rotWithShape="1">
+                    <a:blip r:embed="rId19"/>
+                    <a:srcRect l="4488" t="13892" r="73576" b="40887"/>
+                    <a:stretch/>
+                  </pic:blipFill>
+                  <pic:spPr bwMode="auto">
+                    <a:xfrm>
+                      <a:off x="0" y="0"/>
+                      <a:ext cx="3185508" cy="3692294"/>
+                    </a:xfrm>
+                    <a:prstGeom prst="rect">
+                      <a:avLst/>
+                    </a:prstGeom>
+                    <a:ln>
+                      <a:noFill/>
+                    </a:ln>
+                    <a:extLst>
+                      <a:ext uri="{53640926-AAD7-44D8-BBD7-CCE9431645EC}">
+                        <a14:shadowObscured xmlns:a14="http://schemas.microsoft.com/office/drawing/2010/main"/>
+                      </a:ext>
+                    </a:extLst>
+                  </pic:spPr>
+                </pic:pic>
+              </a:graphicData>
+            </a:graphic>
+          </wp:inline>
+        </w:drawing>
+      </w:r>
+    </w:p>
+    <w:p>
+      <w:pPr>
+        <w:rPr>
+          <w:b/>
+          <w:color w:val="000000" w:themeColor="text1"/>
+          <w:lang w:val="en-US"/>
+        </w:rPr>
+      </w:pPr>
+    </w:p>
+    <w:p>
+      <w:pPr>
+        <w:rPr>
+          <w:b/>
+          <w:color w:val="000000" w:themeColor="text1"/>
+          <w:lang w:val="en-US"/>
+        </w:rPr>
+      </w:pPr>
+      <w:r>
+        <w:rPr>
+          <w:b/>
+          <w:color w:val="000000" w:themeColor="text1"/>
+          <w:lang w:val="en-US"/>
+        </w:rPr>
+        <w:t>Create folder app&gt; calculator.py</w:t>
+      </w:r>
+    </w:p>
+    <w:p>
+      <w:pPr>
+        <w:shd w:val="clear" w:color="auto" w:fill="1F1F1F"/>
+        <w:spacing w:after="0" w:line="285" w:lineRule="atLeast"/>
+        <w:rPr>
+          <w:rFonts w:ascii="Consolas" w:eastAsia="Times New Roman" w:hAnsi="Consolas" w:cs="Times New Roman"/>
+          <w:color w:val="CCCCCC"/>
+          <w:sz w:val="21"/>
+          <w:szCs w:val="21"/>
+          <w:lang w:eastAsia="en-IN"/>
+        </w:rPr>
+      </w:pPr>
+      <w:proofErr w:type="spellStart"/>
+      <w:r>
+        <w:rPr>
+          <w:rFonts w:ascii="Consolas" w:eastAsia="Times New Roman" w:hAnsi="Consolas" w:cs="Times New Roman"/>
+          <w:color w:val="569CD6"/>
+          <w:sz w:val="21"/>
+          <w:szCs w:val="21"/>
+          <w:lang w:eastAsia="en-IN"/>
+        </w:rPr>
+        <w:t>def</w:t>
+      </w:r>
+      <w:proofErr w:type="spellEnd"/>
+      <w:r>
+        <w:rPr>
+          <w:rFonts w:ascii="Consolas" w:eastAsia="Times New Roman" w:hAnsi="Consolas" w:cs="Times New Roman"/>
+          <w:color w:val="CCCCCC"/>
+          <w:sz w:val="21"/>
+          <w:szCs w:val="21"/>
+          <w:lang w:eastAsia="en-IN"/>
+        </w:rPr>
+        <w:t xml:space="preserve"> </w:t>
+      </w:r>
+      <w:r>
+        <w:rPr>
+          <w:rFonts w:ascii="Consolas" w:eastAsia="Times New Roman" w:hAnsi="Consolas" w:cs="Times New Roman"/>
+          <w:color w:val="DCDCAA"/>
+          <w:sz w:val="21"/>
+          <w:szCs w:val="21"/>
+          <w:lang w:eastAsia="en-IN"/>
+        </w:rPr>
+        <w:t>add</w:t>
+      </w:r>
+      <w:r>
+        <w:rPr>
+          <w:rFonts w:ascii="Consolas" w:eastAsia="Times New Roman" w:hAnsi="Consolas" w:cs="Times New Roman"/>
+          <w:color w:val="CCCCCC"/>
+          <w:sz w:val="21"/>
+          <w:szCs w:val="21"/>
+          <w:lang w:eastAsia="en-IN"/>
+        </w:rPr>
+        <w:t>(</w:t>
+      </w:r>
+      <w:proofErr w:type="spellStart"/>
+      <w:proofErr w:type="gramStart"/>
+      <w:r>
+        <w:rPr>
+          <w:rFonts w:ascii="Consolas" w:eastAsia="Times New Roman" w:hAnsi="Consolas" w:cs="Times New Roman"/>
+          <w:color w:val="9CDCFE"/>
+          <w:sz w:val="21"/>
+          <w:szCs w:val="21"/>
+          <w:lang w:eastAsia="en-IN"/>
+        </w:rPr>
+        <w:t>a</w:t>
+      </w:r>
+      <w:r>
+        <w:rPr>
+          <w:rFonts w:ascii="Consolas" w:eastAsia="Times New Roman" w:hAnsi="Consolas" w:cs="Times New Roman"/>
+          <w:color w:val="CCCCCC"/>
+          <w:sz w:val="21"/>
+          <w:szCs w:val="21"/>
+          <w:lang w:eastAsia="en-IN"/>
+        </w:rPr>
+        <w:t>,</w:t>
+      </w:r>
+      <w:r>
+        <w:rPr>
+          <w:rFonts w:ascii="Consolas" w:eastAsia="Times New Roman" w:hAnsi="Consolas" w:cs="Times New Roman"/>
+          <w:color w:val="9CDCFE"/>
+          <w:sz w:val="21"/>
+          <w:szCs w:val="21"/>
+          <w:lang w:eastAsia="en-IN"/>
+        </w:rPr>
+        <w:t>b</w:t>
+      </w:r>
+      <w:proofErr w:type="spellEnd"/>
+      <w:proofErr w:type="gramEnd"/>
+      <w:r>
+        <w:rPr>
+          <w:rFonts w:ascii="Consolas" w:eastAsia="Times New Roman" w:hAnsi="Consolas" w:cs="Times New Roman"/>
+          <w:color w:val="CCCCCC"/>
+          <w:sz w:val="21"/>
+          <w:szCs w:val="21"/>
+          <w:lang w:eastAsia="en-IN"/>
+        </w:rPr>
+        <w:t>):</w:t>
+      </w:r>
+    </w:p>
+    <w:p>
+      <w:pPr>
+        <w:shd w:val="clear" w:color="auto" w:fill="1F1F1F"/>
+        <w:spacing w:after="0" w:line="285" w:lineRule="atLeast"/>
+        <w:rPr>
+          <w:rFonts w:ascii="Consolas" w:eastAsia="Times New Roman" w:hAnsi="Consolas" w:cs="Times New Roman"/>
+          <w:color w:val="CCCCCC"/>
+          <w:sz w:val="21"/>
+          <w:szCs w:val="21"/>
+          <w:lang w:eastAsia="en-IN"/>
+        </w:rPr>
+      </w:pPr>
+      <w:r>
+        <w:rPr>
+          <w:rFonts w:ascii="Consolas" w:eastAsia="Times New Roman" w:hAnsi="Consolas" w:cs="Times New Roman"/>
+          <w:color w:val="CCCCCC"/>
+          <w:sz w:val="21"/>
+          <w:szCs w:val="21"/>
+          <w:lang w:eastAsia="en-IN"/>
+        </w:rPr>
+        <w:t xml:space="preserve">    </w:t>
+      </w:r>
+      <w:r>
+        <w:rPr>
+          <w:rFonts w:ascii="Consolas" w:eastAsia="Times New Roman" w:hAnsi="Consolas" w:cs="Times New Roman"/>
+          <w:color w:val="C586C0"/>
+          <w:sz w:val="21"/>
+          <w:szCs w:val="21"/>
+          <w:lang w:eastAsia="en-IN"/>
+        </w:rPr>
+        <w:t>return</w:t>
+      </w:r>
+      <w:r>
+        <w:rPr>
+          <w:rFonts w:ascii="Consolas" w:eastAsia="Times New Roman" w:hAnsi="Consolas" w:cs="Times New Roman"/>
+          <w:color w:val="CCCCCC"/>
+          <w:sz w:val="21"/>
+          <w:szCs w:val="21"/>
+          <w:lang w:eastAsia="en-IN"/>
+        </w:rPr>
+        <w:t xml:space="preserve"> </w:t>
+      </w:r>
+      <w:proofErr w:type="spellStart"/>
+      <w:r>
+        <w:rPr>
+          <w:rFonts w:ascii="Consolas" w:eastAsia="Times New Roman" w:hAnsi="Consolas" w:cs="Times New Roman"/>
+          <w:color w:val="CCCCCC"/>
+          <w:sz w:val="21"/>
+          <w:szCs w:val="21"/>
+          <w:lang w:eastAsia="en-IN"/>
+        </w:rPr>
+        <w:t>a</w:t>
+      </w:r>
+      <w:r>
+        <w:rPr>
+          <w:rFonts w:ascii="Consolas" w:eastAsia="Times New Roman" w:hAnsi="Consolas" w:cs="Times New Roman"/>
+          <w:color w:val="D4D4D4"/>
+          <w:sz w:val="21"/>
+          <w:szCs w:val="21"/>
+          <w:lang w:eastAsia="en-IN"/>
+        </w:rPr>
+        <w:t>+</w:t>
+      </w:r>
+      <w:r>
+        <w:rPr>
+          <w:rFonts w:ascii="Consolas" w:eastAsia="Times New Roman" w:hAnsi="Consolas" w:cs="Times New Roman"/>
+          <w:color w:val="CCCCCC"/>
+          <w:sz w:val="21"/>
+          <w:szCs w:val="21"/>
+          <w:lang w:eastAsia="en-IN"/>
+        </w:rPr>
+        <w:t>b</w:t>
+      </w:r>
+      <w:proofErr w:type="spellEnd"/>
+    </w:p>
+    <w:p>
+      <w:pPr>
+        <w:shd w:val="clear" w:color="auto" w:fill="1F1F1F"/>
+        <w:spacing w:after="0" w:line="285" w:lineRule="atLeast"/>
+        <w:rPr>
+          <w:rFonts w:ascii="Consolas" w:eastAsia="Times New Roman" w:hAnsi="Consolas" w:cs="Times New Roman"/>
+          <w:color w:val="CCCCCC"/>
+          <w:sz w:val="21"/>
+          <w:szCs w:val="21"/>
+          <w:lang w:eastAsia="en-IN"/>
+        </w:rPr>
+      </w:pPr>
+      <w:proofErr w:type="spellStart"/>
+      <w:r>
+        <w:rPr>
+          <w:rFonts w:ascii="Consolas" w:eastAsia="Times New Roman" w:hAnsi="Consolas" w:cs="Times New Roman"/>
+          <w:color w:val="569CD6"/>
+          <w:sz w:val="21"/>
+          <w:szCs w:val="21"/>
+          <w:lang w:eastAsia="en-IN"/>
+        </w:rPr>
+        <w:t>def</w:t>
+      </w:r>
+      <w:proofErr w:type="spellEnd"/>
+      <w:r>
+        <w:rPr>
+          <w:rFonts w:ascii="Consolas" w:eastAsia="Times New Roman" w:hAnsi="Consolas" w:cs="Times New Roman"/>
+          <w:color w:val="CCCCCC"/>
+          <w:sz w:val="21"/>
+          <w:szCs w:val="21"/>
+          <w:lang w:eastAsia="en-IN"/>
+        </w:rPr>
+        <w:t xml:space="preserve"> </w:t>
+      </w:r>
+      <w:r>
+        <w:rPr>
+          <w:rFonts w:ascii="Consolas" w:eastAsia="Times New Roman" w:hAnsi="Consolas" w:cs="Times New Roman"/>
+          <w:color w:val="DCDCAA"/>
+          <w:sz w:val="21"/>
+          <w:szCs w:val="21"/>
+          <w:lang w:eastAsia="en-IN"/>
+        </w:rPr>
+        <w:t>subtract</w:t>
+      </w:r>
+      <w:r>
+        <w:rPr>
+          <w:rFonts w:ascii="Consolas" w:eastAsia="Times New Roman" w:hAnsi="Consolas" w:cs="Times New Roman"/>
+          <w:color w:val="CCCCCC"/>
+          <w:sz w:val="21"/>
+          <w:szCs w:val="21"/>
+          <w:lang w:eastAsia="en-IN"/>
+        </w:rPr>
+        <w:t>(</w:t>
+      </w:r>
+      <w:proofErr w:type="spellStart"/>
+      <w:proofErr w:type="gramStart"/>
+      <w:r>
+        <w:rPr>
+          <w:rFonts w:ascii="Consolas" w:eastAsia="Times New Roman" w:hAnsi="Consolas" w:cs="Times New Roman"/>
+          <w:color w:val="9CDCFE"/>
+          <w:sz w:val="21"/>
+          <w:szCs w:val="21"/>
+          <w:lang w:eastAsia="en-IN"/>
+        </w:rPr>
+        <w:t>a</w:t>
+      </w:r>
+      <w:r>
+        <w:rPr>
+          <w:rFonts w:ascii="Consolas" w:eastAsia="Times New Roman" w:hAnsi="Consolas" w:cs="Times New Roman"/>
+          <w:color w:val="CCCCCC"/>
+          <w:sz w:val="21"/>
+          <w:szCs w:val="21"/>
+          <w:lang w:eastAsia="en-IN"/>
+        </w:rPr>
+        <w:t>,</w:t>
+      </w:r>
+      <w:r>
+        <w:rPr>
+          <w:rFonts w:ascii="Consolas" w:eastAsia="Times New Roman" w:hAnsi="Consolas" w:cs="Times New Roman"/>
+          <w:color w:val="9CDCFE"/>
+          <w:sz w:val="21"/>
+          <w:szCs w:val="21"/>
+          <w:lang w:eastAsia="en-IN"/>
+        </w:rPr>
+        <w:t>b</w:t>
+      </w:r>
+      <w:proofErr w:type="spellEnd"/>
+      <w:proofErr w:type="gramEnd"/>
+      <w:r>
+        <w:rPr>
+          <w:rFonts w:ascii="Consolas" w:eastAsia="Times New Roman" w:hAnsi="Consolas" w:cs="Times New Roman"/>
+          <w:color w:val="CCCCCC"/>
+          <w:sz w:val="21"/>
+          <w:szCs w:val="21"/>
+          <w:lang w:eastAsia="en-IN"/>
+        </w:rPr>
+        <w:t>):</w:t>
+      </w:r>
+    </w:p>
+    <w:p>
+      <w:pPr>
+        <w:shd w:val="clear" w:color="auto" w:fill="1F1F1F"/>
+        <w:spacing w:after="0" w:line="285" w:lineRule="atLeast"/>
+        <w:rPr>
+          <w:rFonts w:ascii="Consolas" w:eastAsia="Times New Roman" w:hAnsi="Consolas" w:cs="Times New Roman"/>
+          <w:color w:val="CCCCCC"/>
+          <w:sz w:val="21"/>
+          <w:szCs w:val="21"/>
+          <w:lang w:eastAsia="en-IN"/>
+        </w:rPr>
+      </w:pPr>
+      <w:r>
+        <w:rPr>
+          <w:rFonts w:ascii="Consolas" w:eastAsia="Times New Roman" w:hAnsi="Consolas" w:cs="Times New Roman"/>
+          <w:color w:val="CCCCCC"/>
+          <w:sz w:val="21"/>
+          <w:szCs w:val="21"/>
+          <w:lang w:eastAsia="en-IN"/>
+        </w:rPr>
+        <w:t xml:space="preserve">    </w:t>
+      </w:r>
+      <w:r>
+        <w:rPr>
+          <w:rFonts w:ascii="Consolas" w:eastAsia="Times New Roman" w:hAnsi="Consolas" w:cs="Times New Roman"/>
+          <w:color w:val="C586C0"/>
+          <w:sz w:val="21"/>
+          <w:szCs w:val="21"/>
+          <w:lang w:eastAsia="en-IN"/>
+        </w:rPr>
+        <w:t>return</w:t>
+      </w:r>
+      <w:r>
+        <w:rPr>
+          <w:rFonts w:ascii="Consolas" w:eastAsia="Times New Roman" w:hAnsi="Consolas" w:cs="Times New Roman"/>
+          <w:color w:val="CCCCCC"/>
+          <w:sz w:val="21"/>
+          <w:szCs w:val="21"/>
+          <w:lang w:eastAsia="en-IN"/>
+        </w:rPr>
+        <w:t xml:space="preserve"> a</w:t>
+      </w:r>
+      <w:r>
+        <w:rPr>
+          <w:rFonts w:ascii="Consolas" w:eastAsia="Times New Roman" w:hAnsi="Consolas" w:cs="Times New Roman"/>
+          <w:color w:val="D4D4D4"/>
+          <w:sz w:val="21"/>
+          <w:szCs w:val="21"/>
+          <w:lang w:eastAsia="en-IN"/>
+        </w:rPr>
+        <w:t>-</w:t>
+      </w:r>
+      <w:r>
+        <w:rPr>
+          <w:rFonts w:ascii="Consolas" w:eastAsia="Times New Roman" w:hAnsi="Consolas" w:cs="Times New Roman"/>
+          <w:color w:val="CCCCCC"/>
+          <w:sz w:val="21"/>
+          <w:szCs w:val="21"/>
+          <w:lang w:eastAsia="en-IN"/>
+        </w:rPr>
+        <w:t>b</w:t>
+      </w:r>
+    </w:p>
+    <w:p>
+      <w:pPr>
+        <w:shd w:val="clear" w:color="auto" w:fill="1F1F1F"/>
+        <w:spacing w:after="0" w:line="285" w:lineRule="atLeast"/>
+        <w:rPr>
+          <w:rFonts w:ascii="Consolas" w:eastAsia="Times New Roman" w:hAnsi="Consolas" w:cs="Times New Roman"/>
+          <w:color w:val="CCCCCC"/>
+          <w:sz w:val="21"/>
+          <w:szCs w:val="21"/>
+          <w:lang w:eastAsia="en-IN"/>
+        </w:rPr>
+      </w:pPr>
+      <w:proofErr w:type="spellStart"/>
+      <w:r>
+        <w:rPr>
+          <w:rFonts w:ascii="Consolas" w:eastAsia="Times New Roman" w:hAnsi="Consolas" w:cs="Times New Roman"/>
+          <w:color w:val="569CD6"/>
+          <w:sz w:val="21"/>
+          <w:szCs w:val="21"/>
+          <w:lang w:eastAsia="en-IN"/>
+        </w:rPr>
+        <w:t>def</w:t>
+      </w:r>
+      <w:proofErr w:type="spellEnd"/>
+      <w:r>
+        <w:rPr>
+          <w:rFonts w:ascii="Consolas" w:eastAsia="Times New Roman" w:hAnsi="Consolas" w:cs="Times New Roman"/>
+          <w:color w:val="CCCCCC"/>
+          <w:sz w:val="21"/>
+          <w:szCs w:val="21"/>
+          <w:lang w:eastAsia="en-IN"/>
+        </w:rPr>
+        <w:t xml:space="preserve"> </w:t>
+      </w:r>
+      <w:r>
+        <w:rPr>
+          <w:rFonts w:ascii="Consolas" w:eastAsia="Times New Roman" w:hAnsi="Consolas" w:cs="Times New Roman"/>
+          <w:color w:val="DCDCAA"/>
+          <w:sz w:val="21"/>
+          <w:szCs w:val="21"/>
+          <w:lang w:eastAsia="en-IN"/>
+        </w:rPr>
+        <w:t>divide</w:t>
+      </w:r>
+      <w:r>
+        <w:rPr>
+          <w:rFonts w:ascii="Consolas" w:eastAsia="Times New Roman" w:hAnsi="Consolas" w:cs="Times New Roman"/>
+          <w:color w:val="CCCCCC"/>
+          <w:sz w:val="21"/>
+          <w:szCs w:val="21"/>
+          <w:lang w:eastAsia="en-IN"/>
+        </w:rPr>
+        <w:t>(</w:t>
+      </w:r>
+      <w:proofErr w:type="spellStart"/>
+      <w:proofErr w:type="gramStart"/>
+      <w:r>
+        <w:rPr>
+          <w:rFonts w:ascii="Consolas" w:eastAsia="Times New Roman" w:hAnsi="Consolas" w:cs="Times New Roman"/>
+          <w:color w:val="9CDCFE"/>
+          <w:sz w:val="21"/>
+          <w:szCs w:val="21"/>
+          <w:lang w:eastAsia="en-IN"/>
+        </w:rPr>
+        <w:t>a</w:t>
+      </w:r>
+      <w:r>
+        <w:rPr>
+          <w:rFonts w:ascii="Consolas" w:eastAsia="Times New Roman" w:hAnsi="Consolas" w:cs="Times New Roman"/>
+          <w:color w:val="CCCCCC"/>
+          <w:sz w:val="21"/>
+          <w:szCs w:val="21"/>
+          <w:lang w:eastAsia="en-IN"/>
+        </w:rPr>
+        <w:t>,</w:t>
+      </w:r>
+      <w:r>
+        <w:rPr>
+          <w:rFonts w:ascii="Consolas" w:eastAsia="Times New Roman" w:hAnsi="Consolas" w:cs="Times New Roman"/>
+          <w:color w:val="9CDCFE"/>
+          <w:sz w:val="21"/>
+          <w:szCs w:val="21"/>
+          <w:lang w:eastAsia="en-IN"/>
+        </w:rPr>
+        <w:t>b</w:t>
+      </w:r>
+      <w:proofErr w:type="spellEnd"/>
+      <w:proofErr w:type="gramEnd"/>
+      <w:r>
+        <w:rPr>
+          <w:rFonts w:ascii="Consolas" w:eastAsia="Times New Roman" w:hAnsi="Consolas" w:cs="Times New Roman"/>
+          <w:color w:val="CCCCCC"/>
+          <w:sz w:val="21"/>
+          <w:szCs w:val="21"/>
+          <w:lang w:eastAsia="en-IN"/>
+        </w:rPr>
+        <w:t>):</w:t>
+      </w:r>
+    </w:p>
+    <w:p>
+      <w:pPr>
+        <w:shd w:val="clear" w:color="auto" w:fill="1F1F1F"/>
+        <w:spacing w:after="0" w:line="285" w:lineRule="atLeast"/>
+        <w:rPr>
+          <w:rFonts w:ascii="Consolas" w:eastAsia="Times New Roman" w:hAnsi="Consolas" w:cs="Times New Roman"/>
+          <w:color w:val="CCCCCC"/>
+          <w:sz w:val="21"/>
+          <w:szCs w:val="21"/>
+          <w:lang w:eastAsia="en-IN"/>
+        </w:rPr>
+      </w:pPr>
+      <w:r>
+        <w:rPr>
+          <w:rFonts w:ascii="Consolas" w:eastAsia="Times New Roman" w:hAnsi="Consolas" w:cs="Times New Roman"/>
+          <w:color w:val="CCCCCC"/>
+          <w:sz w:val="21"/>
+          <w:szCs w:val="21"/>
+          <w:lang w:eastAsia="en-IN"/>
+        </w:rPr>
+        <w:t xml:space="preserve">    </w:t>
+      </w:r>
+      <w:r>
+        <w:rPr>
+          <w:rFonts w:ascii="Consolas" w:eastAsia="Times New Roman" w:hAnsi="Consolas" w:cs="Times New Roman"/>
+          <w:color w:val="C586C0"/>
+          <w:sz w:val="21"/>
+          <w:szCs w:val="21"/>
+          <w:lang w:eastAsia="en-IN"/>
+        </w:rPr>
+        <w:t>if</w:t>
+      </w:r>
+      <w:r>
+        <w:rPr>
+          <w:rFonts w:ascii="Consolas" w:eastAsia="Times New Roman" w:hAnsi="Consolas" w:cs="Times New Roman"/>
+          <w:color w:val="CCCCCC"/>
+          <w:sz w:val="21"/>
+          <w:szCs w:val="21"/>
+          <w:lang w:eastAsia="en-IN"/>
+        </w:rPr>
+        <w:t xml:space="preserve"> b</w:t>
+      </w:r>
+      <w:r>
+        <w:rPr>
+          <w:rFonts w:ascii="Consolas" w:eastAsia="Times New Roman" w:hAnsi="Consolas" w:cs="Times New Roman"/>
+          <w:color w:val="D4D4D4"/>
+          <w:sz w:val="21"/>
+          <w:szCs w:val="21"/>
+          <w:lang w:eastAsia="en-IN"/>
+        </w:rPr>
+        <w:t>==</w:t>
+      </w:r>
+      <w:r>
+        <w:rPr>
+          <w:rFonts w:ascii="Consolas" w:eastAsia="Times New Roman" w:hAnsi="Consolas" w:cs="Times New Roman"/>
+          <w:color w:val="B5CEA8"/>
+          <w:sz w:val="21"/>
+          <w:szCs w:val="21"/>
+          <w:lang w:eastAsia="en-IN"/>
+        </w:rPr>
+        <w:t>0</w:t>
+      </w:r>
+      <w:r>
+        <w:rPr>
+          <w:rFonts w:ascii="Consolas" w:eastAsia="Times New Roman" w:hAnsi="Consolas" w:cs="Times New Roman"/>
+          <w:color w:val="CCCCCC"/>
+          <w:sz w:val="21"/>
+          <w:szCs w:val="21"/>
+          <w:lang w:eastAsia="en-IN"/>
+        </w:rPr>
+        <w:t>:</w:t>
+      </w:r>
+    </w:p>
+    <w:p>
+      <w:pPr>
+        <w:shd w:val="clear" w:color="auto" w:fill="1F1F1F"/>
+        <w:spacing w:after="0" w:line="285" w:lineRule="atLeast"/>
+        <w:rPr>
+          <w:rFonts w:ascii="Consolas" w:eastAsia="Times New Roman" w:hAnsi="Consolas" w:cs="Times New Roman"/>
+          <w:color w:val="CCCCCC"/>
+          <w:sz w:val="21"/>
+          <w:szCs w:val="21"/>
+          <w:lang w:eastAsia="en-IN"/>
+        </w:rPr>
+      </w:pPr>
+      <w:r>
+        <w:rPr>
+          <w:rFonts w:ascii="Consolas" w:eastAsia="Times New Roman" w:hAnsi="Consolas" w:cs="Times New Roman"/>
+          <w:color w:val="CCCCCC"/>
+          <w:sz w:val="21"/>
+          <w:szCs w:val="21"/>
+          <w:lang w:eastAsia="en-IN"/>
+        </w:rPr>
+        <w:lastRenderedPageBreak/>
+        <w:t xml:space="preserve">        </w:t>
+      </w:r>
+      <w:r>
+        <w:rPr>
+          <w:rFonts w:ascii="Consolas" w:eastAsia="Times New Roman" w:hAnsi="Consolas" w:cs="Times New Roman"/>
+          <w:color w:val="C586C0"/>
+          <w:sz w:val="21"/>
+          <w:szCs w:val="21"/>
+          <w:lang w:eastAsia="en-IN"/>
+        </w:rPr>
+        <w:t>raise</w:t>
+      </w:r>
+      <w:r>
+        <w:rPr>
+          <w:rFonts w:ascii="Consolas" w:eastAsia="Times New Roman" w:hAnsi="Consolas" w:cs="Times New Roman"/>
+          <w:color w:val="CCCCCC"/>
+          <w:sz w:val="21"/>
+          <w:szCs w:val="21"/>
+          <w:lang w:eastAsia="en-IN"/>
+        </w:rPr>
+        <w:t xml:space="preserve"> </w:t>
+      </w:r>
+      <w:proofErr w:type="spellStart"/>
+      <w:proofErr w:type="gramStart"/>
+      <w:r>
+        <w:rPr>
+          <w:rFonts w:ascii="Consolas" w:eastAsia="Times New Roman" w:hAnsi="Consolas" w:cs="Times New Roman"/>
+          <w:color w:val="4EC9B0"/>
+          <w:sz w:val="21"/>
+          <w:szCs w:val="21"/>
+          <w:lang w:eastAsia="en-IN"/>
+        </w:rPr>
+        <w:t>ValueError</w:t>
+      </w:r>
+      <w:proofErr w:type="spellEnd"/>
+      <w:r>
+        <w:rPr>
+          <w:rFonts w:ascii="Consolas" w:eastAsia="Times New Roman" w:hAnsi="Consolas" w:cs="Times New Roman"/>
+          <w:color w:val="CCCCCC"/>
+          <w:sz w:val="21"/>
+          <w:szCs w:val="21"/>
+          <w:lang w:eastAsia="en-IN"/>
+        </w:rPr>
+        <w:t>(</w:t>
+      </w:r>
+      <w:proofErr w:type="gramEnd"/>
+      <w:r>
+        <w:rPr>
+          <w:rFonts w:ascii="Consolas" w:eastAsia="Times New Roman" w:hAnsi="Consolas" w:cs="Times New Roman"/>
+          <w:color w:val="CE9178"/>
+          <w:sz w:val="21"/>
+          <w:szCs w:val="21"/>
+          <w:lang w:eastAsia="en-IN"/>
+        </w:rPr>
+        <w:t>"</w:t>
+      </w:r>
+      <w:proofErr w:type="spellStart"/>
+      <w:r>
+        <w:rPr>
+          <w:rFonts w:ascii="Consolas" w:eastAsia="Times New Roman" w:hAnsi="Consolas" w:cs="Times New Roman"/>
+          <w:color w:val="CE9178"/>
+          <w:sz w:val="21"/>
+          <w:szCs w:val="21"/>
+          <w:lang w:eastAsia="en-IN"/>
+        </w:rPr>
+        <w:t>Can not</w:t>
+      </w:r>
+      <w:proofErr w:type="spellEnd"/>
+      <w:r>
+        <w:rPr>
+          <w:rFonts w:ascii="Consolas" w:eastAsia="Times New Roman" w:hAnsi="Consolas" w:cs="Times New Roman"/>
+          <w:color w:val="CE9178"/>
+          <w:sz w:val="21"/>
+          <w:szCs w:val="21"/>
+          <w:lang w:eastAsia="en-IN"/>
+        </w:rPr>
+        <w:t xml:space="preserve"> divide by zero"</w:t>
+      </w:r>
+      <w:r>
+        <w:rPr>
+          <w:rFonts w:ascii="Consolas" w:eastAsia="Times New Roman" w:hAnsi="Consolas" w:cs="Times New Roman"/>
+          <w:color w:val="CCCCCC"/>
+          <w:sz w:val="21"/>
+          <w:szCs w:val="21"/>
+          <w:lang w:eastAsia="en-IN"/>
+        </w:rPr>
+        <w:t>)</w:t>
+      </w:r>
+    </w:p>
+    <w:p>
+      <w:pPr>
+        <w:shd w:val="clear" w:color="auto" w:fill="1F1F1F"/>
+        <w:spacing w:after="0" w:line="285" w:lineRule="atLeast"/>
+        <w:rPr>
+          <w:rFonts w:ascii="Consolas" w:eastAsia="Times New Roman" w:hAnsi="Consolas" w:cs="Times New Roman"/>
+          <w:color w:val="CCCCCC"/>
+          <w:sz w:val="21"/>
+          <w:szCs w:val="21"/>
+          <w:lang w:eastAsia="en-IN"/>
+        </w:rPr>
+      </w:pPr>
+      <w:r>
+        <w:rPr>
+          <w:rFonts w:ascii="Consolas" w:eastAsia="Times New Roman" w:hAnsi="Consolas" w:cs="Times New Roman"/>
+          <w:color w:val="CCCCCC"/>
+          <w:sz w:val="21"/>
+          <w:szCs w:val="21"/>
+          <w:lang w:eastAsia="en-IN"/>
+        </w:rPr>
+        <w:t xml:space="preserve">    </w:t>
+      </w:r>
+      <w:r>
+        <w:rPr>
+          <w:rFonts w:ascii="Consolas" w:eastAsia="Times New Roman" w:hAnsi="Consolas" w:cs="Times New Roman"/>
+          <w:color w:val="C586C0"/>
+          <w:sz w:val="21"/>
+          <w:szCs w:val="21"/>
+          <w:lang w:eastAsia="en-IN"/>
+        </w:rPr>
+        <w:t>return</w:t>
+      </w:r>
+      <w:r>
+        <w:rPr>
+          <w:rFonts w:ascii="Consolas" w:eastAsia="Times New Roman" w:hAnsi="Consolas" w:cs="Times New Roman"/>
+          <w:color w:val="CCCCCC"/>
+          <w:sz w:val="21"/>
+          <w:szCs w:val="21"/>
+          <w:lang w:eastAsia="en-IN"/>
+        </w:rPr>
+        <w:t xml:space="preserve"> a</w:t>
+      </w:r>
+      <w:r>
+        <w:rPr>
+          <w:rFonts w:ascii="Consolas" w:eastAsia="Times New Roman" w:hAnsi="Consolas" w:cs="Times New Roman"/>
+          <w:color w:val="D4D4D4"/>
+          <w:sz w:val="21"/>
+          <w:szCs w:val="21"/>
+          <w:lang w:eastAsia="en-IN"/>
+        </w:rPr>
+        <w:t>/</w:t>
+      </w:r>
+      <w:r>
+        <w:rPr>
+          <w:rFonts w:ascii="Consolas" w:eastAsia="Times New Roman" w:hAnsi="Consolas" w:cs="Times New Roman"/>
+          <w:color w:val="CCCCCC"/>
+          <w:sz w:val="21"/>
+          <w:szCs w:val="21"/>
+          <w:lang w:eastAsia="en-IN"/>
+        </w:rPr>
+        <w:t>b</w:t>
+      </w:r>
+    </w:p>
+    <w:p>
+      <w:pPr>
+        <w:shd w:val="clear" w:color="auto" w:fill="1F1F1F"/>
+        <w:spacing w:after="0" w:line="285" w:lineRule="atLeast"/>
+        <w:rPr>
+          <w:rFonts w:ascii="Consolas" w:eastAsia="Times New Roman" w:hAnsi="Consolas" w:cs="Times New Roman"/>
+          <w:color w:val="CCCCCC"/>
+          <w:sz w:val="21"/>
+          <w:szCs w:val="21"/>
+          <w:lang w:eastAsia="en-IN"/>
+        </w:rPr>
+      </w:pPr>
+      <w:proofErr w:type="spellStart"/>
+      <w:r>
+        <w:rPr>
+          <w:rFonts w:ascii="Consolas" w:eastAsia="Times New Roman" w:hAnsi="Consolas" w:cs="Times New Roman"/>
+          <w:color w:val="569CD6"/>
+          <w:sz w:val="21"/>
+          <w:szCs w:val="21"/>
+          <w:lang w:eastAsia="en-IN"/>
+        </w:rPr>
+        <w:t>def</w:t>
+      </w:r>
+      <w:proofErr w:type="spellEnd"/>
+      <w:r>
+        <w:rPr>
+          <w:rFonts w:ascii="Consolas" w:eastAsia="Times New Roman" w:hAnsi="Consolas" w:cs="Times New Roman"/>
+          <w:color w:val="CCCCCC"/>
+          <w:sz w:val="21"/>
+          <w:szCs w:val="21"/>
+          <w:lang w:eastAsia="en-IN"/>
+        </w:rPr>
+        <w:t xml:space="preserve"> </w:t>
+      </w:r>
+      <w:r>
+        <w:rPr>
+          <w:rFonts w:ascii="Consolas" w:eastAsia="Times New Roman" w:hAnsi="Consolas" w:cs="Times New Roman"/>
+          <w:color w:val="DCDCAA"/>
+          <w:sz w:val="21"/>
+          <w:szCs w:val="21"/>
+          <w:lang w:eastAsia="en-IN"/>
+        </w:rPr>
+        <w:t>multiply</w:t>
+      </w:r>
+      <w:r>
+        <w:rPr>
+          <w:rFonts w:ascii="Consolas" w:eastAsia="Times New Roman" w:hAnsi="Consolas" w:cs="Times New Roman"/>
+          <w:color w:val="CCCCCC"/>
+          <w:sz w:val="21"/>
+          <w:szCs w:val="21"/>
+          <w:lang w:eastAsia="en-IN"/>
+        </w:rPr>
+        <w:t>(</w:t>
+      </w:r>
+      <w:proofErr w:type="gramStart"/>
+      <w:r>
+        <w:rPr>
+          <w:rFonts w:ascii="Consolas" w:eastAsia="Times New Roman" w:hAnsi="Consolas" w:cs="Times New Roman"/>
+          <w:color w:val="9CDCFE"/>
+          <w:sz w:val="21"/>
+          <w:szCs w:val="21"/>
+          <w:lang w:eastAsia="en-IN"/>
+        </w:rPr>
+        <w:t>a</w:t>
+      </w:r>
+      <w:r>
+        <w:rPr>
+          <w:rFonts w:ascii="Consolas" w:eastAsia="Times New Roman" w:hAnsi="Consolas" w:cs="Times New Roman"/>
+          <w:color w:val="CCCCCC"/>
+          <w:sz w:val="21"/>
+          <w:szCs w:val="21"/>
+          <w:lang w:eastAsia="en-IN"/>
+        </w:rPr>
+        <w:t>,</w:t>
+      </w:r>
+      <w:r>
+        <w:rPr>
+          <w:rFonts w:ascii="Consolas" w:eastAsia="Times New Roman" w:hAnsi="Consolas" w:cs="Times New Roman"/>
+          <w:color w:val="9CDCFE"/>
+          <w:sz w:val="21"/>
+          <w:szCs w:val="21"/>
+          <w:lang w:eastAsia="en-IN"/>
+        </w:rPr>
+        <w:t>b</w:t>
+      </w:r>
+      <w:proofErr w:type="gramEnd"/>
+      <w:r>
+        <w:rPr>
+          <w:rFonts w:ascii="Consolas" w:eastAsia="Times New Roman" w:hAnsi="Consolas" w:cs="Times New Roman"/>
+          <w:color w:val="CCCCCC"/>
+          <w:sz w:val="21"/>
+          <w:szCs w:val="21"/>
+          <w:lang w:eastAsia="en-IN"/>
+        </w:rPr>
+        <w:t>):</w:t>
+      </w:r>
+    </w:p>
+    <w:p>
+      <w:pPr>
+        <w:shd w:val="clear" w:color="auto" w:fill="1F1F1F"/>
+        <w:spacing w:after="0" w:line="285" w:lineRule="atLeast"/>
+        <w:rPr>
+          <w:rFonts w:ascii="Consolas" w:eastAsia="Times New Roman" w:hAnsi="Consolas" w:cs="Times New Roman"/>
+          <w:color w:val="CCCCCC"/>
+          <w:sz w:val="21"/>
+          <w:szCs w:val="21"/>
+          <w:lang w:eastAsia="en-IN"/>
+        </w:rPr>
+      </w:pPr>
+      <w:r>
+        <w:rPr>
+          <w:rFonts w:ascii="Consolas" w:eastAsia="Times New Roman" w:hAnsi="Consolas" w:cs="Times New Roman"/>
+          <w:color w:val="CCCCCC"/>
+          <w:sz w:val="21"/>
+          <w:szCs w:val="21"/>
+          <w:lang w:eastAsia="en-IN"/>
+        </w:rPr>
+        <w:t xml:space="preserve">    </w:t>
+      </w:r>
+      <w:r>
+        <w:rPr>
+          <w:rFonts w:ascii="Consolas" w:eastAsia="Times New Roman" w:hAnsi="Consolas" w:cs="Times New Roman"/>
+          <w:color w:val="C586C0"/>
+          <w:sz w:val="21"/>
+          <w:szCs w:val="21"/>
+          <w:lang w:eastAsia="en-IN"/>
+        </w:rPr>
+        <w:t>return</w:t>
+      </w:r>
+      <w:r>
+        <w:rPr>
+          <w:rFonts w:ascii="Consolas" w:eastAsia="Times New Roman" w:hAnsi="Consolas" w:cs="Times New Roman"/>
+          <w:color w:val="CCCCCC"/>
+          <w:sz w:val="21"/>
+          <w:szCs w:val="21"/>
+          <w:lang w:eastAsia="en-IN"/>
+        </w:rPr>
+        <w:t xml:space="preserve"> a</w:t>
+      </w:r>
+      <w:r>
+        <w:rPr>
+          <w:rFonts w:ascii="Consolas" w:eastAsia="Times New Roman" w:hAnsi="Consolas" w:cs="Times New Roman"/>
+          <w:color w:val="D4D4D4"/>
+          <w:sz w:val="21"/>
+          <w:szCs w:val="21"/>
+          <w:lang w:eastAsia="en-IN"/>
+        </w:rPr>
+        <w:t>*</w:t>
+      </w:r>
+      <w:r>
+        <w:rPr>
+          <w:rFonts w:ascii="Consolas" w:eastAsia="Times New Roman" w:hAnsi="Consolas" w:cs="Times New Roman"/>
+          <w:color w:val="CCCCCC"/>
+          <w:sz w:val="21"/>
+          <w:szCs w:val="21"/>
+          <w:lang w:eastAsia="en-IN"/>
+        </w:rPr>
+        <w:t>b</w:t>
+      </w:r>
+    </w:p>
+    <w:p>
+      <w:pPr>
+        <w:rPr>
+          <w:b/>
+          <w:color w:val="000000" w:themeColor="text1"/>
+          <w:lang w:val="en-US"/>
+        </w:rPr>
+      </w:pPr>
+    </w:p>
+    <w:p>
+      <w:pPr>
+        <w:rPr>
+          <w:b/>
+          <w:color w:val="000000" w:themeColor="text1"/>
+          <w:lang w:val="en-US"/>
+        </w:rPr>
+      </w:pPr>
+      <w:r>
+        <w:rPr>
+          <w:b/>
+          <w:color w:val="000000" w:themeColor="text1"/>
+          <w:lang w:val="en-US"/>
+        </w:rPr>
+        <w:t>create tests folder&gt; test_calculator.py</w:t>
+      </w:r>
+    </w:p>
+    <w:p>
+      <w:pPr>
+        <w:shd w:val="clear" w:color="auto" w:fill="1F1F1F"/>
+        <w:spacing w:after="0" w:line="285" w:lineRule="atLeast"/>
+        <w:rPr>
+          <w:rFonts w:ascii="Consolas" w:eastAsia="Times New Roman" w:hAnsi="Consolas" w:cs="Times New Roman"/>
+          <w:color w:val="CCCCCC"/>
+          <w:sz w:val="21"/>
+          <w:szCs w:val="21"/>
+          <w:lang w:eastAsia="en-IN"/>
+        </w:rPr>
+      </w:pPr>
+      <w:r>
+        <w:rPr>
+          <w:rFonts w:ascii="Consolas" w:eastAsia="Times New Roman" w:hAnsi="Consolas" w:cs="Times New Roman"/>
+          <w:color w:val="C586C0"/>
+          <w:sz w:val="21"/>
+          <w:szCs w:val="21"/>
+          <w:lang w:eastAsia="en-IN"/>
+        </w:rPr>
+        <w:t>import</w:t>
+      </w:r>
+      <w:r>
+        <w:rPr>
+          <w:rFonts w:ascii="Consolas" w:eastAsia="Times New Roman" w:hAnsi="Consolas" w:cs="Times New Roman"/>
+          <w:color w:val="CCCCCC"/>
+          <w:sz w:val="21"/>
+          <w:szCs w:val="21"/>
+          <w:lang w:eastAsia="en-IN"/>
+        </w:rPr>
+        <w:t xml:space="preserve"> </w:t>
+      </w:r>
+      <w:proofErr w:type="spellStart"/>
+      <w:r>
+        <w:rPr>
+          <w:rFonts w:ascii="Consolas" w:eastAsia="Times New Roman" w:hAnsi="Consolas" w:cs="Times New Roman"/>
+          <w:color w:val="CCCCCC"/>
+          <w:sz w:val="21"/>
+          <w:szCs w:val="21"/>
+          <w:lang w:eastAsia="en-IN"/>
+        </w:rPr>
+        <w:t>pytest</w:t>
+      </w:r>
+      <w:proofErr w:type="spellEnd"/>
+    </w:p>
+    <w:p>
+      <w:pPr>
+        <w:shd w:val="clear" w:color="auto" w:fill="1F1F1F"/>
+        <w:spacing w:after="0" w:line="285" w:lineRule="atLeast"/>
+        <w:rPr>
+          <w:rFonts w:ascii="Consolas" w:eastAsia="Times New Roman" w:hAnsi="Consolas" w:cs="Times New Roman"/>
+          <w:color w:val="CCCCCC"/>
+          <w:sz w:val="21"/>
+          <w:szCs w:val="21"/>
+          <w:lang w:eastAsia="en-IN"/>
+        </w:rPr>
+      </w:pPr>
+      <w:r>
+        <w:rPr>
+          <w:rFonts w:ascii="Consolas" w:eastAsia="Times New Roman" w:hAnsi="Consolas" w:cs="Times New Roman"/>
+          <w:color w:val="C586C0"/>
+          <w:sz w:val="21"/>
+          <w:szCs w:val="21"/>
+          <w:lang w:eastAsia="en-IN"/>
+        </w:rPr>
+        <w:t>from</w:t>
+      </w:r>
+      <w:r>
+        <w:rPr>
+          <w:rFonts w:ascii="Consolas" w:eastAsia="Times New Roman" w:hAnsi="Consolas" w:cs="Times New Roman"/>
+          <w:color w:val="CCCCCC"/>
+          <w:sz w:val="21"/>
+          <w:szCs w:val="21"/>
+          <w:lang w:eastAsia="en-IN"/>
+        </w:rPr>
+        <w:t xml:space="preserve"> </w:t>
+      </w:r>
+      <w:proofErr w:type="spellStart"/>
+      <w:proofErr w:type="gramStart"/>
+      <w:r>
+        <w:rPr>
+          <w:rFonts w:ascii="Consolas" w:eastAsia="Times New Roman" w:hAnsi="Consolas" w:cs="Times New Roman"/>
+          <w:color w:val="CCCCCC"/>
+          <w:sz w:val="21"/>
+          <w:szCs w:val="21"/>
+          <w:lang w:eastAsia="en-IN"/>
+        </w:rPr>
+        <w:t>app.calculator</w:t>
+      </w:r>
+      <w:proofErr w:type="spellEnd"/>
+      <w:proofErr w:type="gramEnd"/>
+      <w:r>
+        <w:rPr>
+          <w:rFonts w:ascii="Consolas" w:eastAsia="Times New Roman" w:hAnsi="Consolas" w:cs="Times New Roman"/>
+          <w:color w:val="CCCCCC"/>
+          <w:sz w:val="21"/>
+          <w:szCs w:val="21"/>
+          <w:lang w:eastAsia="en-IN"/>
+        </w:rPr>
+        <w:t xml:space="preserve"> </w:t>
+      </w:r>
+      <w:r>
+        <w:rPr>
+          <w:rFonts w:ascii="Consolas" w:eastAsia="Times New Roman" w:hAnsi="Consolas" w:cs="Times New Roman"/>
+          <w:color w:val="C586C0"/>
+          <w:sz w:val="21"/>
+          <w:szCs w:val="21"/>
+          <w:lang w:eastAsia="en-IN"/>
+        </w:rPr>
+        <w:t>import</w:t>
+      </w:r>
+      <w:r>
+        <w:rPr>
+          <w:rFonts w:ascii="Consolas" w:eastAsia="Times New Roman" w:hAnsi="Consolas" w:cs="Times New Roman"/>
+          <w:color w:val="CCCCCC"/>
+          <w:sz w:val="21"/>
+          <w:szCs w:val="21"/>
+          <w:lang w:eastAsia="en-IN"/>
+        </w:rPr>
+        <w:t xml:space="preserve"> </w:t>
+      </w:r>
+      <w:proofErr w:type="spellStart"/>
+      <w:r>
+        <w:rPr>
+          <w:rFonts w:ascii="Consolas" w:eastAsia="Times New Roman" w:hAnsi="Consolas" w:cs="Times New Roman"/>
+          <w:color w:val="CCCCCC"/>
+          <w:sz w:val="21"/>
+          <w:szCs w:val="21"/>
+          <w:lang w:eastAsia="en-IN"/>
+        </w:rPr>
+        <w:t>add,subtract,divide,multiply</w:t>
+      </w:r>
+      <w:proofErr w:type="spellEnd"/>
+    </w:p>
+    <w:p>
+      <w:pPr>
+        <w:shd w:val="clear" w:color="auto" w:fill="1F1F1F"/>
+        <w:spacing w:after="0" w:line="285" w:lineRule="atLeast"/>
+        <w:rPr>
+          <w:rFonts w:ascii="Consolas" w:eastAsia="Times New Roman" w:hAnsi="Consolas" w:cs="Times New Roman"/>
+          <w:color w:val="CCCCCC"/>
+          <w:sz w:val="21"/>
+          <w:szCs w:val="21"/>
+          <w:lang w:eastAsia="en-IN"/>
+        </w:rPr>
+      </w:pPr>
+    </w:p>
+    <w:p>
+      <w:pPr>
+        <w:shd w:val="clear" w:color="auto" w:fill="1F1F1F"/>
+        <w:spacing w:after="0" w:line="285" w:lineRule="atLeast"/>
+        <w:rPr>
+          <w:rFonts w:ascii="Consolas" w:eastAsia="Times New Roman" w:hAnsi="Consolas" w:cs="Times New Roman"/>
+          <w:color w:val="CCCCCC"/>
+          <w:sz w:val="21"/>
+          <w:szCs w:val="21"/>
+          <w:lang w:eastAsia="en-IN"/>
+        </w:rPr>
+      </w:pPr>
+      <w:proofErr w:type="spellStart"/>
+      <w:r>
+        <w:rPr>
+          <w:rFonts w:ascii="Consolas" w:eastAsia="Times New Roman" w:hAnsi="Consolas" w:cs="Times New Roman"/>
+          <w:color w:val="569CD6"/>
+          <w:sz w:val="21"/>
+          <w:szCs w:val="21"/>
+          <w:lang w:eastAsia="en-IN"/>
+        </w:rPr>
+        <w:t>def</w:t>
+      </w:r>
+      <w:proofErr w:type="spellEnd"/>
+      <w:r>
+        <w:rPr>
+          <w:rFonts w:ascii="Consolas" w:eastAsia="Times New Roman" w:hAnsi="Consolas" w:cs="Times New Roman"/>
+          <w:color w:val="CCCCCC"/>
+          <w:sz w:val="21"/>
+          <w:szCs w:val="21"/>
+          <w:lang w:eastAsia="en-IN"/>
+        </w:rPr>
+        <w:t xml:space="preserve"> </w:t>
+      </w:r>
+      <w:proofErr w:type="spellStart"/>
+      <w:r>
+        <w:rPr>
+          <w:rFonts w:ascii="Consolas" w:eastAsia="Times New Roman" w:hAnsi="Consolas" w:cs="Times New Roman"/>
+          <w:color w:val="DCDCAA"/>
+          <w:sz w:val="21"/>
+          <w:szCs w:val="21"/>
+          <w:lang w:eastAsia="en-IN"/>
+        </w:rPr>
+        <w:t>test_</w:t>
+      </w:r>
+      <w:proofErr w:type="gramStart"/>
+      <w:r>
+        <w:rPr>
+          <w:rFonts w:ascii="Consolas" w:eastAsia="Times New Roman" w:hAnsi="Consolas" w:cs="Times New Roman"/>
+          <w:color w:val="DCDCAA"/>
+          <w:sz w:val="21"/>
+          <w:szCs w:val="21"/>
+          <w:lang w:eastAsia="en-IN"/>
+        </w:rPr>
+        <w:t>add</w:t>
+      </w:r>
+      <w:proofErr w:type="spellEnd"/>
+      <w:r>
+        <w:rPr>
+          <w:rFonts w:ascii="Consolas" w:eastAsia="Times New Roman" w:hAnsi="Consolas" w:cs="Times New Roman"/>
+          <w:color w:val="CCCCCC"/>
+          <w:sz w:val="21"/>
+          <w:szCs w:val="21"/>
+          <w:lang w:eastAsia="en-IN"/>
+        </w:rPr>
+        <w:t>(</w:t>
+      </w:r>
+      <w:proofErr w:type="gramEnd"/>
+      <w:r>
+        <w:rPr>
+          <w:rFonts w:ascii="Consolas" w:eastAsia="Times New Roman" w:hAnsi="Consolas" w:cs="Times New Roman"/>
+          <w:color w:val="CCCCCC"/>
+          <w:sz w:val="21"/>
+          <w:szCs w:val="21"/>
+          <w:lang w:eastAsia="en-IN"/>
+        </w:rPr>
+        <w:t>):</w:t>
+      </w:r>
+    </w:p>
+    <w:p>
+      <w:pPr>
+        <w:shd w:val="clear" w:color="auto" w:fill="1F1F1F"/>
+        <w:spacing w:after="0" w:line="285" w:lineRule="atLeast"/>
+        <w:rPr>
+          <w:rFonts w:ascii="Consolas" w:eastAsia="Times New Roman" w:hAnsi="Consolas" w:cs="Times New Roman"/>
+          <w:color w:val="CCCCCC"/>
+          <w:sz w:val="21"/>
+          <w:szCs w:val="21"/>
+          <w:lang w:eastAsia="en-IN"/>
+        </w:rPr>
+      </w:pPr>
+      <w:r>
+        <w:rPr>
+          <w:rFonts w:ascii="Consolas" w:eastAsia="Times New Roman" w:hAnsi="Consolas" w:cs="Times New Roman"/>
+          <w:color w:val="CCCCCC"/>
+          <w:sz w:val="21"/>
+          <w:szCs w:val="21"/>
+          <w:lang w:eastAsia="en-IN"/>
+        </w:rPr>
+        <w:t xml:space="preserve">    </w:t>
+      </w:r>
+      <w:r>
+        <w:rPr>
+          <w:rFonts w:ascii="Consolas" w:eastAsia="Times New Roman" w:hAnsi="Consolas" w:cs="Times New Roman"/>
+          <w:color w:val="C586C0"/>
+          <w:sz w:val="21"/>
+          <w:szCs w:val="21"/>
+          <w:lang w:eastAsia="en-IN"/>
+        </w:rPr>
+        <w:t>assert</w:t>
+      </w:r>
+      <w:r>
+        <w:rPr>
+          <w:rFonts w:ascii="Consolas" w:eastAsia="Times New Roman" w:hAnsi="Consolas" w:cs="Times New Roman"/>
+          <w:color w:val="CCCCCC"/>
+          <w:sz w:val="21"/>
+          <w:szCs w:val="21"/>
+          <w:lang w:eastAsia="en-IN"/>
+        </w:rPr>
+        <w:t xml:space="preserve"> </w:t>
+      </w:r>
+      <w:proofErr w:type="gramStart"/>
+      <w:r>
+        <w:rPr>
+          <w:rFonts w:ascii="Consolas" w:eastAsia="Times New Roman" w:hAnsi="Consolas" w:cs="Times New Roman"/>
+          <w:color w:val="CCCCCC"/>
+          <w:sz w:val="21"/>
+          <w:szCs w:val="21"/>
+          <w:lang w:eastAsia="en-IN"/>
+        </w:rPr>
+        <w:t>add(</w:t>
+      </w:r>
+      <w:proofErr w:type="gramEnd"/>
+      <w:r>
+        <w:rPr>
+          <w:rFonts w:ascii="Consolas" w:eastAsia="Times New Roman" w:hAnsi="Consolas" w:cs="Times New Roman"/>
+          <w:color w:val="B5CEA8"/>
+          <w:sz w:val="21"/>
+          <w:szCs w:val="21"/>
+          <w:lang w:eastAsia="en-IN"/>
+        </w:rPr>
+        <w:t>2</w:t>
+      </w:r>
+      <w:r>
+        <w:rPr>
+          <w:rFonts w:ascii="Consolas" w:eastAsia="Times New Roman" w:hAnsi="Consolas" w:cs="Times New Roman"/>
+          <w:color w:val="CCCCCC"/>
+          <w:sz w:val="21"/>
+          <w:szCs w:val="21"/>
+          <w:lang w:eastAsia="en-IN"/>
+        </w:rPr>
+        <w:t>,</w:t>
+      </w:r>
+      <w:r>
+        <w:rPr>
+          <w:rFonts w:ascii="Consolas" w:eastAsia="Times New Roman" w:hAnsi="Consolas" w:cs="Times New Roman"/>
+          <w:color w:val="B5CEA8"/>
+          <w:sz w:val="21"/>
+          <w:szCs w:val="21"/>
+          <w:lang w:eastAsia="en-IN"/>
+        </w:rPr>
+        <w:t>3</w:t>
+      </w:r>
+      <w:r>
+        <w:rPr>
+          <w:rFonts w:ascii="Consolas" w:eastAsia="Times New Roman" w:hAnsi="Consolas" w:cs="Times New Roman"/>
+          <w:color w:val="CCCCCC"/>
+          <w:sz w:val="21"/>
+          <w:szCs w:val="21"/>
+          <w:lang w:eastAsia="en-IN"/>
+        </w:rPr>
+        <w:t xml:space="preserve">) </w:t>
+      </w:r>
+      <w:r>
+        <w:rPr>
+          <w:rFonts w:ascii="Consolas" w:eastAsia="Times New Roman" w:hAnsi="Consolas" w:cs="Times New Roman"/>
+          <w:color w:val="D4D4D4"/>
+          <w:sz w:val="21"/>
+          <w:szCs w:val="21"/>
+          <w:lang w:eastAsia="en-IN"/>
+        </w:rPr>
+        <w:t>==</w:t>
+      </w:r>
+      <w:r>
+        <w:rPr>
+          <w:rFonts w:ascii="Consolas" w:eastAsia="Times New Roman" w:hAnsi="Consolas" w:cs="Times New Roman"/>
+          <w:color w:val="CCCCCC"/>
+          <w:sz w:val="21"/>
+          <w:szCs w:val="21"/>
+          <w:lang w:eastAsia="en-IN"/>
+        </w:rPr>
+        <w:t xml:space="preserve"> </w:t>
+      </w:r>
+      <w:r>
+        <w:rPr>
+          <w:rFonts w:ascii="Consolas" w:eastAsia="Times New Roman" w:hAnsi="Consolas" w:cs="Times New Roman"/>
+          <w:color w:val="B5CEA8"/>
+          <w:sz w:val="21"/>
+          <w:szCs w:val="21"/>
+          <w:lang w:eastAsia="en-IN"/>
+        </w:rPr>
+        <w:t>5</w:t>
+      </w:r>
+    </w:p>
+    <w:p>
+      <w:pPr>
+        <w:shd w:val="clear" w:color="auto" w:fill="1F1F1F"/>
+        <w:spacing w:after="0" w:line="285" w:lineRule="atLeast"/>
+        <w:rPr>
+          <w:rFonts w:ascii="Consolas" w:eastAsia="Times New Roman" w:hAnsi="Consolas" w:cs="Times New Roman"/>
+          <w:color w:val="CCCCCC"/>
+          <w:sz w:val="21"/>
+          <w:szCs w:val="21"/>
+          <w:lang w:eastAsia="en-IN"/>
+        </w:rPr>
+      </w:pPr>
+      <w:proofErr w:type="spellStart"/>
+      <w:r>
+        <w:rPr>
+          <w:rFonts w:ascii="Consolas" w:eastAsia="Times New Roman" w:hAnsi="Consolas" w:cs="Times New Roman"/>
+          <w:color w:val="569CD6"/>
+          <w:sz w:val="21"/>
+          <w:szCs w:val="21"/>
+          <w:lang w:eastAsia="en-IN"/>
+        </w:rPr>
+        <w:t>def</w:t>
+      </w:r>
+      <w:proofErr w:type="spellEnd"/>
+      <w:r>
+        <w:rPr>
+          <w:rFonts w:ascii="Consolas" w:eastAsia="Times New Roman" w:hAnsi="Consolas" w:cs="Times New Roman"/>
+          <w:color w:val="CCCCCC"/>
+          <w:sz w:val="21"/>
+          <w:szCs w:val="21"/>
+          <w:lang w:eastAsia="en-IN"/>
+        </w:rPr>
+        <w:t xml:space="preserve"> </w:t>
+      </w:r>
+      <w:proofErr w:type="spellStart"/>
+      <w:r>
+        <w:rPr>
+          <w:rFonts w:ascii="Consolas" w:eastAsia="Times New Roman" w:hAnsi="Consolas" w:cs="Times New Roman"/>
+          <w:color w:val="DCDCAA"/>
+          <w:sz w:val="21"/>
+          <w:szCs w:val="21"/>
+          <w:lang w:eastAsia="en-IN"/>
+        </w:rPr>
+        <w:t>test_</w:t>
+      </w:r>
+      <w:proofErr w:type="gramStart"/>
+      <w:r>
+        <w:rPr>
+          <w:rFonts w:ascii="Consolas" w:eastAsia="Times New Roman" w:hAnsi="Consolas" w:cs="Times New Roman"/>
+          <w:color w:val="DCDCAA"/>
+          <w:sz w:val="21"/>
+          <w:szCs w:val="21"/>
+          <w:lang w:eastAsia="en-IN"/>
+        </w:rPr>
+        <w:t>subtract</w:t>
+      </w:r>
+      <w:proofErr w:type="spellEnd"/>
+      <w:r>
+        <w:rPr>
+          <w:rFonts w:ascii="Consolas" w:eastAsia="Times New Roman" w:hAnsi="Consolas" w:cs="Times New Roman"/>
+          <w:color w:val="CCCCCC"/>
+          <w:sz w:val="21"/>
+          <w:szCs w:val="21"/>
+          <w:lang w:eastAsia="en-IN"/>
+        </w:rPr>
+        <w:t>(</w:t>
+      </w:r>
+      <w:proofErr w:type="gramEnd"/>
+      <w:r>
+        <w:rPr>
+          <w:rFonts w:ascii="Consolas" w:eastAsia="Times New Roman" w:hAnsi="Consolas" w:cs="Times New Roman"/>
+          <w:color w:val="CCCCCC"/>
+          <w:sz w:val="21"/>
+          <w:szCs w:val="21"/>
+          <w:lang w:eastAsia="en-IN"/>
+        </w:rPr>
+        <w:t>):</w:t>
+      </w:r>
+    </w:p>
+    <w:p>
+      <w:pPr>
+        <w:shd w:val="clear" w:color="auto" w:fill="1F1F1F"/>
+        <w:spacing w:after="0" w:line="285" w:lineRule="atLeast"/>
+        <w:rPr>
+          <w:rFonts w:ascii="Consolas" w:eastAsia="Times New Roman" w:hAnsi="Consolas" w:cs="Times New Roman"/>
+          <w:color w:val="CCCCCC"/>
+          <w:sz w:val="21"/>
+          <w:szCs w:val="21"/>
+          <w:lang w:eastAsia="en-IN"/>
+        </w:rPr>
+      </w:pPr>
+      <w:r>
+        <w:rPr>
+          <w:rFonts w:ascii="Consolas" w:eastAsia="Times New Roman" w:hAnsi="Consolas" w:cs="Times New Roman"/>
+          <w:color w:val="CCCCCC"/>
+          <w:sz w:val="21"/>
+          <w:szCs w:val="21"/>
+          <w:lang w:eastAsia="en-IN"/>
+        </w:rPr>
+        <w:t xml:space="preserve">    </w:t>
+      </w:r>
+      <w:r>
+        <w:rPr>
+          <w:rFonts w:ascii="Consolas" w:eastAsia="Times New Roman" w:hAnsi="Consolas" w:cs="Times New Roman"/>
+          <w:color w:val="C586C0"/>
+          <w:sz w:val="21"/>
+          <w:szCs w:val="21"/>
+          <w:lang w:eastAsia="en-IN"/>
+        </w:rPr>
+        <w:t>assert</w:t>
+      </w:r>
+      <w:r>
+        <w:rPr>
+          <w:rFonts w:ascii="Consolas" w:eastAsia="Times New Roman" w:hAnsi="Consolas" w:cs="Times New Roman"/>
+          <w:color w:val="CCCCCC"/>
+          <w:sz w:val="21"/>
+          <w:szCs w:val="21"/>
+          <w:lang w:eastAsia="en-IN"/>
+        </w:rPr>
+        <w:t xml:space="preserve"> </w:t>
+      </w:r>
+      <w:proofErr w:type="gramStart"/>
+      <w:r>
+        <w:rPr>
+          <w:rFonts w:ascii="Consolas" w:eastAsia="Times New Roman" w:hAnsi="Consolas" w:cs="Times New Roman"/>
+          <w:color w:val="CCCCCC"/>
+          <w:sz w:val="21"/>
+          <w:szCs w:val="21"/>
+          <w:lang w:eastAsia="en-IN"/>
+        </w:rPr>
+        <w:t>subtract(</w:t>
+      </w:r>
+      <w:proofErr w:type="gramEnd"/>
+      <w:r>
+        <w:rPr>
+          <w:rFonts w:ascii="Consolas" w:eastAsia="Times New Roman" w:hAnsi="Consolas" w:cs="Times New Roman"/>
+          <w:color w:val="B5CEA8"/>
+          <w:sz w:val="21"/>
+          <w:szCs w:val="21"/>
+          <w:lang w:eastAsia="en-IN"/>
+        </w:rPr>
+        <w:t>10</w:t>
+      </w:r>
+      <w:r>
+        <w:rPr>
+          <w:rFonts w:ascii="Consolas" w:eastAsia="Times New Roman" w:hAnsi="Consolas" w:cs="Times New Roman"/>
+          <w:color w:val="CCCCCC"/>
+          <w:sz w:val="21"/>
+          <w:szCs w:val="21"/>
+          <w:lang w:eastAsia="en-IN"/>
+        </w:rPr>
+        <w:t>,</w:t>
+      </w:r>
+      <w:r>
+        <w:rPr>
+          <w:rFonts w:ascii="Consolas" w:eastAsia="Times New Roman" w:hAnsi="Consolas" w:cs="Times New Roman"/>
+          <w:color w:val="B5CEA8"/>
+          <w:sz w:val="21"/>
+          <w:szCs w:val="21"/>
+          <w:lang w:eastAsia="en-IN"/>
+        </w:rPr>
+        <w:t>2</w:t>
+      </w:r>
+      <w:r>
+        <w:rPr>
+          <w:rFonts w:ascii="Consolas" w:eastAsia="Times New Roman" w:hAnsi="Consolas" w:cs="Times New Roman"/>
+          <w:color w:val="CCCCCC"/>
+          <w:sz w:val="21"/>
+          <w:szCs w:val="21"/>
+          <w:lang w:eastAsia="en-IN"/>
+        </w:rPr>
+        <w:t xml:space="preserve">) </w:t>
+      </w:r>
+      <w:r>
+        <w:rPr>
+          <w:rFonts w:ascii="Consolas" w:eastAsia="Times New Roman" w:hAnsi="Consolas" w:cs="Times New Roman"/>
+          <w:color w:val="D4D4D4"/>
+          <w:sz w:val="21"/>
+          <w:szCs w:val="21"/>
+          <w:lang w:eastAsia="en-IN"/>
+        </w:rPr>
+        <w:t>==</w:t>
+      </w:r>
+      <w:r>
+        <w:rPr>
+          <w:rFonts w:ascii="Consolas" w:eastAsia="Times New Roman" w:hAnsi="Consolas" w:cs="Times New Roman"/>
+          <w:color w:val="CCCCCC"/>
+          <w:sz w:val="21"/>
+          <w:szCs w:val="21"/>
+          <w:lang w:eastAsia="en-IN"/>
+        </w:rPr>
+        <w:t xml:space="preserve"> </w:t>
+      </w:r>
+      <w:r>
+        <w:rPr>
+          <w:rFonts w:ascii="Consolas" w:eastAsia="Times New Roman" w:hAnsi="Consolas" w:cs="Times New Roman"/>
+          <w:color w:val="B5CEA8"/>
+          <w:sz w:val="21"/>
+          <w:szCs w:val="21"/>
+          <w:lang w:eastAsia="en-IN"/>
+        </w:rPr>
+        <w:t>8</w:t>
+      </w:r>
+    </w:p>
+    <w:p>
+      <w:pPr>
+        <w:shd w:val="clear" w:color="auto" w:fill="1F1F1F"/>
+        <w:spacing w:after="0" w:line="285" w:lineRule="atLeast"/>
+        <w:rPr>
+          <w:rFonts w:ascii="Consolas" w:eastAsia="Times New Roman" w:hAnsi="Consolas" w:cs="Times New Roman"/>
+          <w:color w:val="CCCCCC"/>
+          <w:sz w:val="21"/>
+          <w:szCs w:val="21"/>
+          <w:lang w:eastAsia="en-IN"/>
+        </w:rPr>
+      </w:pPr>
+      <w:proofErr w:type="spellStart"/>
+      <w:r>
+        <w:rPr>
+          <w:rFonts w:ascii="Consolas" w:eastAsia="Times New Roman" w:hAnsi="Consolas" w:cs="Times New Roman"/>
+          <w:color w:val="569CD6"/>
+          <w:sz w:val="21"/>
+          <w:szCs w:val="21"/>
+          <w:lang w:eastAsia="en-IN"/>
+        </w:rPr>
+        <w:t>def</w:t>
+      </w:r>
+      <w:proofErr w:type="spellEnd"/>
+      <w:r>
+        <w:rPr>
+          <w:rFonts w:ascii="Consolas" w:eastAsia="Times New Roman" w:hAnsi="Consolas" w:cs="Times New Roman"/>
+          <w:color w:val="CCCCCC"/>
+          <w:sz w:val="21"/>
+          <w:szCs w:val="21"/>
+          <w:lang w:eastAsia="en-IN"/>
+        </w:rPr>
+        <w:t xml:space="preserve"> </w:t>
+      </w:r>
+      <w:proofErr w:type="spellStart"/>
+      <w:r>
+        <w:rPr>
+          <w:rFonts w:ascii="Consolas" w:eastAsia="Times New Roman" w:hAnsi="Consolas" w:cs="Times New Roman"/>
+          <w:color w:val="DCDCAA"/>
+          <w:sz w:val="21"/>
+          <w:szCs w:val="21"/>
+          <w:lang w:eastAsia="en-IN"/>
+        </w:rPr>
+        <w:t>test_</w:t>
+      </w:r>
+      <w:proofErr w:type="gramStart"/>
+      <w:r>
+        <w:rPr>
+          <w:rFonts w:ascii="Consolas" w:eastAsia="Times New Roman" w:hAnsi="Consolas" w:cs="Times New Roman"/>
+          <w:color w:val="DCDCAA"/>
+          <w:sz w:val="21"/>
+          <w:szCs w:val="21"/>
+          <w:lang w:eastAsia="en-IN"/>
+        </w:rPr>
+        <w:t>divide</w:t>
+      </w:r>
+      <w:proofErr w:type="spellEnd"/>
+      <w:r>
+        <w:rPr>
+          <w:rFonts w:ascii="Consolas" w:eastAsia="Times New Roman" w:hAnsi="Consolas" w:cs="Times New Roman"/>
+          <w:color w:val="CCCCCC"/>
+          <w:sz w:val="21"/>
+          <w:szCs w:val="21"/>
+          <w:lang w:eastAsia="en-IN"/>
+        </w:rPr>
+        <w:t>(</w:t>
+      </w:r>
+      <w:proofErr w:type="gramEnd"/>
+      <w:r>
+        <w:rPr>
+          <w:rFonts w:ascii="Consolas" w:eastAsia="Times New Roman" w:hAnsi="Consolas" w:cs="Times New Roman"/>
+          <w:color w:val="CCCCCC"/>
+          <w:sz w:val="21"/>
+          <w:szCs w:val="21"/>
+          <w:lang w:eastAsia="en-IN"/>
+        </w:rPr>
+        <w:t>):</w:t>
+      </w:r>
+    </w:p>
+    <w:p>
+      <w:pPr>
+        <w:shd w:val="clear" w:color="auto" w:fill="1F1F1F"/>
+        <w:spacing w:after="0" w:line="285" w:lineRule="atLeast"/>
+        <w:rPr>
+          <w:rFonts w:ascii="Consolas" w:eastAsia="Times New Roman" w:hAnsi="Consolas" w:cs="Times New Roman"/>
+          <w:color w:val="CCCCCC"/>
+          <w:sz w:val="21"/>
+          <w:szCs w:val="21"/>
+          <w:lang w:eastAsia="en-IN"/>
+        </w:rPr>
+      </w:pPr>
+      <w:r>
+        <w:rPr>
+          <w:rFonts w:ascii="Consolas" w:eastAsia="Times New Roman" w:hAnsi="Consolas" w:cs="Times New Roman"/>
+          <w:color w:val="CCCCCC"/>
+          <w:sz w:val="21"/>
+          <w:szCs w:val="21"/>
+          <w:lang w:eastAsia="en-IN"/>
+        </w:rPr>
+        <w:t xml:space="preserve">    </w:t>
+      </w:r>
+      <w:r>
+        <w:rPr>
+          <w:rFonts w:ascii="Consolas" w:eastAsia="Times New Roman" w:hAnsi="Consolas" w:cs="Times New Roman"/>
+          <w:color w:val="C586C0"/>
+          <w:sz w:val="21"/>
+          <w:szCs w:val="21"/>
+          <w:lang w:eastAsia="en-IN"/>
+        </w:rPr>
+        <w:t>assert</w:t>
+      </w:r>
+      <w:r>
+        <w:rPr>
+          <w:rFonts w:ascii="Consolas" w:eastAsia="Times New Roman" w:hAnsi="Consolas" w:cs="Times New Roman"/>
+          <w:color w:val="CCCCCC"/>
+          <w:sz w:val="21"/>
+          <w:szCs w:val="21"/>
+          <w:lang w:eastAsia="en-IN"/>
+        </w:rPr>
+        <w:t xml:space="preserve"> </w:t>
+      </w:r>
+      <w:proofErr w:type="gramStart"/>
+      <w:r>
+        <w:rPr>
+          <w:rFonts w:ascii="Consolas" w:eastAsia="Times New Roman" w:hAnsi="Consolas" w:cs="Times New Roman"/>
+          <w:color w:val="CCCCCC"/>
+          <w:sz w:val="21"/>
+          <w:szCs w:val="21"/>
+          <w:lang w:eastAsia="en-IN"/>
+        </w:rPr>
+        <w:t>divide(</w:t>
+      </w:r>
+      <w:proofErr w:type="gramEnd"/>
+      <w:r>
+        <w:rPr>
+          <w:rFonts w:ascii="Consolas" w:eastAsia="Times New Roman" w:hAnsi="Consolas" w:cs="Times New Roman"/>
+          <w:color w:val="B5CEA8"/>
+          <w:sz w:val="21"/>
+          <w:szCs w:val="21"/>
+          <w:lang w:eastAsia="en-IN"/>
+        </w:rPr>
+        <w:t>20</w:t>
+      </w:r>
+      <w:r>
+        <w:rPr>
+          <w:rFonts w:ascii="Consolas" w:eastAsia="Times New Roman" w:hAnsi="Consolas" w:cs="Times New Roman"/>
+          <w:color w:val="CCCCCC"/>
+          <w:sz w:val="21"/>
+          <w:szCs w:val="21"/>
+          <w:lang w:eastAsia="en-IN"/>
+        </w:rPr>
+        <w:t>,</w:t>
+      </w:r>
+      <w:r>
+        <w:rPr>
+          <w:rFonts w:ascii="Consolas" w:eastAsia="Times New Roman" w:hAnsi="Consolas" w:cs="Times New Roman"/>
+          <w:color w:val="B5CEA8"/>
+          <w:sz w:val="21"/>
+          <w:szCs w:val="21"/>
+          <w:lang w:eastAsia="en-IN"/>
+        </w:rPr>
+        <w:t>10</w:t>
+      </w:r>
+      <w:r>
+        <w:rPr>
+          <w:rFonts w:ascii="Consolas" w:eastAsia="Times New Roman" w:hAnsi="Consolas" w:cs="Times New Roman"/>
+          <w:color w:val="CCCCCC"/>
+          <w:sz w:val="21"/>
+          <w:szCs w:val="21"/>
+          <w:lang w:eastAsia="en-IN"/>
+        </w:rPr>
+        <w:t xml:space="preserve">) </w:t>
+      </w:r>
+      <w:r>
+        <w:rPr>
+          <w:rFonts w:ascii="Consolas" w:eastAsia="Times New Roman" w:hAnsi="Consolas" w:cs="Times New Roman"/>
+          <w:color w:val="D4D4D4"/>
+          <w:sz w:val="21"/>
+          <w:szCs w:val="21"/>
+          <w:lang w:eastAsia="en-IN"/>
+        </w:rPr>
+        <w:t>==</w:t>
+      </w:r>
+      <w:r>
+        <w:rPr>
+          <w:rFonts w:ascii="Consolas" w:eastAsia="Times New Roman" w:hAnsi="Consolas" w:cs="Times New Roman"/>
+          <w:color w:val="CCCCCC"/>
+          <w:sz w:val="21"/>
+          <w:szCs w:val="21"/>
+          <w:lang w:eastAsia="en-IN"/>
+        </w:rPr>
+        <w:t xml:space="preserve"> </w:t>
+      </w:r>
+      <w:r>
+        <w:rPr>
+          <w:rFonts w:ascii="Consolas" w:eastAsia="Times New Roman" w:hAnsi="Consolas" w:cs="Times New Roman"/>
+          <w:color w:val="B5CEA8"/>
+          <w:sz w:val="21"/>
+          <w:szCs w:val="21"/>
+          <w:lang w:eastAsia="en-IN"/>
+        </w:rPr>
+        <w:t>2</w:t>
+      </w:r>
+    </w:p>
+    <w:p>
+      <w:pPr>
+        <w:shd w:val="clear" w:color="auto" w:fill="1F1F1F"/>
+        <w:spacing w:after="0" w:line="285" w:lineRule="atLeast"/>
+        <w:rPr>
+          <w:rFonts w:ascii="Consolas" w:eastAsia="Times New Roman" w:hAnsi="Consolas" w:cs="Times New Roman"/>
+          <w:color w:val="CCCCCC"/>
+          <w:sz w:val="21"/>
+          <w:szCs w:val="21"/>
+          <w:lang w:eastAsia="en-IN"/>
+        </w:rPr>
+      </w:pPr>
+      <w:proofErr w:type="spellStart"/>
+      <w:r>
+        <w:rPr>
+          <w:rFonts w:ascii="Consolas" w:eastAsia="Times New Roman" w:hAnsi="Consolas" w:cs="Times New Roman"/>
+          <w:color w:val="569CD6"/>
+          <w:sz w:val="21"/>
+          <w:szCs w:val="21"/>
+          <w:lang w:eastAsia="en-IN"/>
+        </w:rPr>
+        <w:t>def</w:t>
+      </w:r>
+      <w:proofErr w:type="spellEnd"/>
+      <w:r>
+        <w:rPr>
+          <w:rFonts w:ascii="Consolas" w:eastAsia="Times New Roman" w:hAnsi="Consolas" w:cs="Times New Roman"/>
+          <w:color w:val="CCCCCC"/>
+          <w:sz w:val="21"/>
+          <w:szCs w:val="21"/>
+          <w:lang w:eastAsia="en-IN"/>
+        </w:rPr>
+        <w:t xml:space="preserve"> </w:t>
+      </w:r>
+      <w:proofErr w:type="spellStart"/>
+      <w:r>
+        <w:rPr>
+          <w:rFonts w:ascii="Consolas" w:eastAsia="Times New Roman" w:hAnsi="Consolas" w:cs="Times New Roman"/>
+          <w:color w:val="DCDCAA"/>
+          <w:sz w:val="21"/>
+          <w:szCs w:val="21"/>
+          <w:lang w:eastAsia="en-IN"/>
+        </w:rPr>
+        <w:t>test_</w:t>
+      </w:r>
+      <w:proofErr w:type="gramStart"/>
+      <w:r>
+        <w:rPr>
+          <w:rFonts w:ascii="Consolas" w:eastAsia="Times New Roman" w:hAnsi="Consolas" w:cs="Times New Roman"/>
+          <w:color w:val="DCDCAA"/>
+          <w:sz w:val="21"/>
+          <w:szCs w:val="21"/>
+          <w:lang w:eastAsia="en-IN"/>
+        </w:rPr>
+        <w:t>multiply</w:t>
+      </w:r>
+      <w:proofErr w:type="spellEnd"/>
+      <w:r>
+        <w:rPr>
+          <w:rFonts w:ascii="Consolas" w:eastAsia="Times New Roman" w:hAnsi="Consolas" w:cs="Times New Roman"/>
+          <w:color w:val="CCCCCC"/>
+          <w:sz w:val="21"/>
+          <w:szCs w:val="21"/>
+          <w:lang w:eastAsia="en-IN"/>
+        </w:rPr>
+        <w:t>(</w:t>
+      </w:r>
+      <w:proofErr w:type="gramEnd"/>
+      <w:r>
+        <w:rPr>
+          <w:rFonts w:ascii="Consolas" w:eastAsia="Times New Roman" w:hAnsi="Consolas" w:cs="Times New Roman"/>
+          <w:color w:val="CCCCCC"/>
+          <w:sz w:val="21"/>
+          <w:szCs w:val="21"/>
+          <w:lang w:eastAsia="en-IN"/>
+        </w:rPr>
+        <w:t>):</w:t>
+      </w:r>
+    </w:p>
+    <w:p>
+      <w:pPr>
+        <w:shd w:val="clear" w:color="auto" w:fill="1F1F1F"/>
+        <w:spacing w:after="0" w:line="285" w:lineRule="atLeast"/>
+        <w:rPr>
+          <w:rFonts w:ascii="Consolas" w:eastAsia="Times New Roman" w:hAnsi="Consolas" w:cs="Times New Roman"/>
+          <w:color w:val="CCCCCC"/>
+          <w:sz w:val="21"/>
+          <w:szCs w:val="21"/>
+          <w:lang w:eastAsia="en-IN"/>
+        </w:rPr>
+      </w:pPr>
+      <w:r>
+        <w:rPr>
+          <w:rFonts w:ascii="Consolas" w:eastAsia="Times New Roman" w:hAnsi="Consolas" w:cs="Times New Roman"/>
+          <w:color w:val="CCCCCC"/>
+          <w:sz w:val="21"/>
+          <w:szCs w:val="21"/>
+          <w:lang w:eastAsia="en-IN"/>
+        </w:rPr>
+        <w:t xml:space="preserve">    </w:t>
+      </w:r>
+      <w:r>
+        <w:rPr>
+          <w:rFonts w:ascii="Consolas" w:eastAsia="Times New Roman" w:hAnsi="Consolas" w:cs="Times New Roman"/>
+          <w:color w:val="C586C0"/>
+          <w:sz w:val="21"/>
+          <w:szCs w:val="21"/>
+          <w:lang w:eastAsia="en-IN"/>
+        </w:rPr>
+        <w:t>assert</w:t>
+      </w:r>
+      <w:r>
+        <w:rPr>
+          <w:rFonts w:ascii="Consolas" w:eastAsia="Times New Roman" w:hAnsi="Consolas" w:cs="Times New Roman"/>
+          <w:color w:val="CCCCCC"/>
+          <w:sz w:val="21"/>
+          <w:szCs w:val="21"/>
+          <w:lang w:eastAsia="en-IN"/>
+        </w:rPr>
+        <w:t xml:space="preserve"> </w:t>
+      </w:r>
+      <w:proofErr w:type="gramStart"/>
+      <w:r>
+        <w:rPr>
+          <w:rFonts w:ascii="Consolas" w:eastAsia="Times New Roman" w:hAnsi="Consolas" w:cs="Times New Roman"/>
+          <w:color w:val="CCCCCC"/>
+          <w:sz w:val="21"/>
+          <w:szCs w:val="21"/>
+          <w:lang w:eastAsia="en-IN"/>
+        </w:rPr>
+        <w:t>multiply(</w:t>
+      </w:r>
+      <w:proofErr w:type="gramEnd"/>
+      <w:r>
+        <w:rPr>
+          <w:rFonts w:ascii="Consolas" w:eastAsia="Times New Roman" w:hAnsi="Consolas" w:cs="Times New Roman"/>
+          <w:color w:val="B5CEA8"/>
+          <w:sz w:val="21"/>
+          <w:szCs w:val="21"/>
+          <w:lang w:eastAsia="en-IN"/>
+        </w:rPr>
+        <w:t>3</w:t>
+      </w:r>
+      <w:r>
+        <w:rPr>
+          <w:rFonts w:ascii="Consolas" w:eastAsia="Times New Roman" w:hAnsi="Consolas" w:cs="Times New Roman"/>
+          <w:color w:val="CCCCCC"/>
+          <w:sz w:val="21"/>
+          <w:szCs w:val="21"/>
+          <w:lang w:eastAsia="en-IN"/>
+        </w:rPr>
+        <w:t>,</w:t>
+      </w:r>
+      <w:r>
+        <w:rPr>
+          <w:rFonts w:ascii="Consolas" w:eastAsia="Times New Roman" w:hAnsi="Consolas" w:cs="Times New Roman"/>
+          <w:color w:val="B5CEA8"/>
+          <w:sz w:val="21"/>
+          <w:szCs w:val="21"/>
+          <w:lang w:eastAsia="en-IN"/>
+        </w:rPr>
+        <w:t>9</w:t>
+      </w:r>
+      <w:r>
+        <w:rPr>
+          <w:rFonts w:ascii="Consolas" w:eastAsia="Times New Roman" w:hAnsi="Consolas" w:cs="Times New Roman"/>
+          <w:color w:val="CCCCCC"/>
+          <w:sz w:val="21"/>
+          <w:szCs w:val="21"/>
+          <w:lang w:eastAsia="en-IN"/>
+        </w:rPr>
+        <w:t>)</w:t>
+      </w:r>
+      <w:r>
+        <w:rPr>
+          <w:rFonts w:ascii="Consolas" w:eastAsia="Times New Roman" w:hAnsi="Consolas" w:cs="Times New Roman"/>
+          <w:color w:val="D4D4D4"/>
+          <w:sz w:val="21"/>
+          <w:szCs w:val="21"/>
+          <w:lang w:eastAsia="en-IN"/>
+        </w:rPr>
+        <w:t>==</w:t>
+      </w:r>
+      <w:r>
+        <w:rPr>
+          <w:rFonts w:ascii="Consolas" w:eastAsia="Times New Roman" w:hAnsi="Consolas" w:cs="Times New Roman"/>
+          <w:color w:val="B5CEA8"/>
+          <w:sz w:val="21"/>
+          <w:szCs w:val="21"/>
+          <w:lang w:eastAsia="en-IN"/>
+        </w:rPr>
+        <w:t>27</w:t>
+      </w:r>
+    </w:p>
+    <w:p>
+      <w:pPr>
+        <w:shd w:val="clear" w:color="auto" w:fill="1F1F1F"/>
+        <w:spacing w:after="0" w:line="285" w:lineRule="atLeast"/>
+        <w:rPr>
+          <w:rFonts w:ascii="Consolas" w:eastAsia="Times New Roman" w:hAnsi="Consolas" w:cs="Times New Roman"/>
+          <w:color w:val="CCCCCC"/>
+          <w:sz w:val="21"/>
+          <w:szCs w:val="21"/>
+          <w:lang w:eastAsia="en-IN"/>
+        </w:rPr>
+      </w:pPr>
+      <w:proofErr w:type="spellStart"/>
+      <w:r>
+        <w:rPr>
+          <w:rFonts w:ascii="Consolas" w:eastAsia="Times New Roman" w:hAnsi="Consolas" w:cs="Times New Roman"/>
+          <w:color w:val="569CD6"/>
+          <w:sz w:val="21"/>
+          <w:szCs w:val="21"/>
+          <w:lang w:eastAsia="en-IN"/>
+        </w:rPr>
+        <w:t>def</w:t>
+      </w:r>
+      <w:proofErr w:type="spellEnd"/>
+      <w:r>
+        <w:rPr>
+          <w:rFonts w:ascii="Consolas" w:eastAsia="Times New Roman" w:hAnsi="Consolas" w:cs="Times New Roman"/>
+          <w:color w:val="CCCCCC"/>
+          <w:sz w:val="21"/>
+          <w:szCs w:val="21"/>
+          <w:lang w:eastAsia="en-IN"/>
+        </w:rPr>
+        <w:t xml:space="preserve"> </w:t>
+      </w:r>
+      <w:proofErr w:type="spellStart"/>
+      <w:r>
+        <w:rPr>
+          <w:rFonts w:ascii="Consolas" w:eastAsia="Times New Roman" w:hAnsi="Consolas" w:cs="Times New Roman"/>
+          <w:color w:val="DCDCAA"/>
+          <w:sz w:val="21"/>
+          <w:szCs w:val="21"/>
+          <w:lang w:eastAsia="en-IN"/>
+        </w:rPr>
+        <w:t>test_divide_by_</w:t>
+      </w:r>
+      <w:proofErr w:type="gramStart"/>
+      <w:r>
+        <w:rPr>
+          <w:rFonts w:ascii="Consolas" w:eastAsia="Times New Roman" w:hAnsi="Consolas" w:cs="Times New Roman"/>
+          <w:color w:val="DCDCAA"/>
+          <w:sz w:val="21"/>
+          <w:szCs w:val="21"/>
+          <w:lang w:eastAsia="en-IN"/>
+        </w:rPr>
+        <w:t>zero</w:t>
+      </w:r>
+      <w:proofErr w:type="spellEnd"/>
+      <w:r>
+        <w:rPr>
+          <w:rFonts w:ascii="Consolas" w:eastAsia="Times New Roman" w:hAnsi="Consolas" w:cs="Times New Roman"/>
+          <w:color w:val="CCCCCC"/>
+          <w:sz w:val="21"/>
+          <w:szCs w:val="21"/>
+          <w:lang w:eastAsia="en-IN"/>
+        </w:rPr>
+        <w:t>(</w:t>
+      </w:r>
+      <w:proofErr w:type="gramEnd"/>
+      <w:r>
+        <w:rPr>
+          <w:rFonts w:ascii="Consolas" w:eastAsia="Times New Roman" w:hAnsi="Consolas" w:cs="Times New Roman"/>
+          <w:color w:val="CCCCCC"/>
+          <w:sz w:val="21"/>
+          <w:szCs w:val="21"/>
+          <w:lang w:eastAsia="en-IN"/>
+        </w:rPr>
+        <w:t>):</w:t>
+      </w:r>
+    </w:p>
+    <w:p>
+      <w:pPr>
+        <w:shd w:val="clear" w:color="auto" w:fill="1F1F1F"/>
+        <w:spacing w:after="0" w:line="285" w:lineRule="atLeast"/>
+        <w:rPr>
+          <w:rFonts w:ascii="Consolas" w:eastAsia="Times New Roman" w:hAnsi="Consolas" w:cs="Times New Roman"/>
+          <w:color w:val="CCCCCC"/>
+          <w:sz w:val="21"/>
+          <w:szCs w:val="21"/>
+          <w:lang w:eastAsia="en-IN"/>
+        </w:rPr>
+      </w:pPr>
+      <w:r>
+        <w:rPr>
+          <w:rFonts w:ascii="Consolas" w:eastAsia="Times New Roman" w:hAnsi="Consolas" w:cs="Times New Roman"/>
+          <w:color w:val="CCCCCC"/>
+          <w:sz w:val="21"/>
+          <w:szCs w:val="21"/>
+          <w:lang w:eastAsia="en-IN"/>
+        </w:rPr>
+        <w:t xml:space="preserve">    </w:t>
+      </w:r>
+      <w:r>
+        <w:rPr>
+          <w:rFonts w:ascii="Consolas" w:eastAsia="Times New Roman" w:hAnsi="Consolas" w:cs="Times New Roman"/>
+          <w:color w:val="C586C0"/>
+          <w:sz w:val="21"/>
+          <w:szCs w:val="21"/>
+          <w:lang w:eastAsia="en-IN"/>
+        </w:rPr>
+        <w:t>with</w:t>
+      </w:r>
+      <w:r>
+        <w:rPr>
+          <w:rFonts w:ascii="Consolas" w:eastAsia="Times New Roman" w:hAnsi="Consolas" w:cs="Times New Roman"/>
+          <w:color w:val="CCCCCC"/>
+          <w:sz w:val="21"/>
+          <w:szCs w:val="21"/>
+          <w:lang w:eastAsia="en-IN"/>
+        </w:rPr>
+        <w:t xml:space="preserve"> </w:t>
+      </w:r>
+      <w:proofErr w:type="gramStart"/>
+      <w:r>
+        <w:rPr>
+          <w:rFonts w:ascii="Consolas" w:eastAsia="Times New Roman" w:hAnsi="Consolas" w:cs="Times New Roman"/>
+          <w:color w:val="CCCCCC"/>
+          <w:sz w:val="21"/>
+          <w:szCs w:val="21"/>
+          <w:lang w:eastAsia="en-IN"/>
+        </w:rPr>
+        <w:t>pytest.raises</w:t>
+      </w:r>
+      <w:proofErr w:type="gramEnd"/>
+      <w:r>
+        <w:rPr>
+          <w:rFonts w:ascii="Consolas" w:eastAsia="Times New Roman" w:hAnsi="Consolas" w:cs="Times New Roman"/>
+          <w:color w:val="CCCCCC"/>
+          <w:sz w:val="21"/>
+          <w:szCs w:val="21"/>
+          <w:lang w:eastAsia="en-IN"/>
+        </w:rPr>
+        <w:t>(</w:t>
+      </w:r>
+      <w:r>
+        <w:rPr>
+          <w:rFonts w:ascii="Consolas" w:eastAsia="Times New Roman" w:hAnsi="Consolas" w:cs="Times New Roman"/>
+          <w:color w:val="4EC9B0"/>
+          <w:sz w:val="21"/>
+          <w:szCs w:val="21"/>
+          <w:lang w:eastAsia="en-IN"/>
+        </w:rPr>
+        <w:t>ValueError</w:t>
+      </w:r>
+      <w:r>
+        <w:rPr>
+          <w:rFonts w:ascii="Consolas" w:eastAsia="Times New Roman" w:hAnsi="Consolas" w:cs="Times New Roman"/>
+          <w:color w:val="CCCCCC"/>
+          <w:sz w:val="21"/>
+          <w:szCs w:val="21"/>
+          <w:lang w:eastAsia="en-IN"/>
+        </w:rPr>
+        <w:t>):</w:t>
+      </w:r>
+    </w:p>
+    <w:p>
+      <w:pPr>
+        <w:shd w:val="clear" w:color="auto" w:fill="1F1F1F"/>
+        <w:spacing w:after="0" w:line="285" w:lineRule="atLeast"/>
+        <w:rPr>
+          <w:rFonts w:ascii="Consolas" w:eastAsia="Times New Roman" w:hAnsi="Consolas" w:cs="Times New Roman"/>
+          <w:color w:val="CCCCCC"/>
+          <w:sz w:val="21"/>
+          <w:szCs w:val="21"/>
+          <w:lang w:eastAsia="en-IN"/>
+        </w:rPr>
+      </w:pPr>
+      <w:r>
+        <w:rPr>
+          <w:rFonts w:ascii="Consolas" w:eastAsia="Times New Roman" w:hAnsi="Consolas" w:cs="Times New Roman"/>
+          <w:color w:val="CCCCCC"/>
+          <w:sz w:val="21"/>
+          <w:szCs w:val="21"/>
+          <w:lang w:eastAsia="en-IN"/>
+        </w:rPr>
+        <w:t xml:space="preserve">        </w:t>
+      </w:r>
+      <w:proofErr w:type="gramStart"/>
+      <w:r>
+        <w:rPr>
+          <w:rFonts w:ascii="Consolas" w:eastAsia="Times New Roman" w:hAnsi="Consolas" w:cs="Times New Roman"/>
+          <w:color w:val="CCCCCC"/>
+          <w:sz w:val="21"/>
+          <w:szCs w:val="21"/>
+          <w:lang w:eastAsia="en-IN"/>
+        </w:rPr>
+        <w:t>divide(</w:t>
+      </w:r>
+      <w:proofErr w:type="gramEnd"/>
+      <w:r>
+        <w:rPr>
+          <w:rFonts w:ascii="Consolas" w:eastAsia="Times New Roman" w:hAnsi="Consolas" w:cs="Times New Roman"/>
+          <w:color w:val="B5CEA8"/>
+          <w:sz w:val="21"/>
+          <w:szCs w:val="21"/>
+          <w:lang w:eastAsia="en-IN"/>
+        </w:rPr>
+        <w:t>10</w:t>
+      </w:r>
+      <w:r>
+        <w:rPr>
+          <w:rFonts w:ascii="Consolas" w:eastAsia="Times New Roman" w:hAnsi="Consolas" w:cs="Times New Roman"/>
+          <w:color w:val="CCCCCC"/>
+          <w:sz w:val="21"/>
+          <w:szCs w:val="21"/>
+          <w:lang w:eastAsia="en-IN"/>
+        </w:rPr>
+        <w:t>,</w:t>
+      </w:r>
+      <w:r>
+        <w:rPr>
+          <w:rFonts w:ascii="Consolas" w:eastAsia="Times New Roman" w:hAnsi="Consolas" w:cs="Times New Roman"/>
+          <w:color w:val="B5CEA8"/>
+          <w:sz w:val="21"/>
+          <w:szCs w:val="21"/>
+          <w:lang w:eastAsia="en-IN"/>
+        </w:rPr>
+        <w:t>0</w:t>
+      </w:r>
+      <w:r>
+        <w:rPr>
+          <w:rFonts w:ascii="Consolas" w:eastAsia="Times New Roman" w:hAnsi="Consolas" w:cs="Times New Roman"/>
+          <w:color w:val="CCCCCC"/>
+          <w:sz w:val="21"/>
+          <w:szCs w:val="21"/>
+          <w:lang w:eastAsia="en-IN"/>
+        </w:rPr>
+        <w:t>)</w:t>
+      </w:r>
+    </w:p>
+    <w:p>
+      <w:pPr>
+        <w:shd w:val="clear" w:color="auto" w:fill="1F1F1F"/>
+        <w:spacing w:after="0" w:line="285" w:lineRule="atLeast"/>
+        <w:rPr>
+          <w:rFonts w:ascii="Consolas" w:eastAsia="Times New Roman" w:hAnsi="Consolas" w:cs="Times New Roman"/>
+          <w:color w:val="CCCCCC"/>
+          <w:sz w:val="21"/>
+          <w:szCs w:val="21"/>
+          <w:lang w:eastAsia="en-IN"/>
+        </w:rPr>
+      </w:pPr>
+    </w:p>
+    <w:p>
+      <w:pPr>
+        <w:rPr>
+          <w:b/>
+          <w:color w:val="000000" w:themeColor="text1"/>
+          <w:lang w:val="en-US"/>
+        </w:rPr>
+      </w:pPr>
+    </w:p>
+    <w:p>
+      <w:pPr>
+        <w:rPr>
+          <w:b/>
+          <w:color w:val="000000" w:themeColor="text1"/>
+          <w:lang w:val="en-US"/>
+        </w:rPr>
+      </w:pPr>
+      <w:r>
+        <w:rPr>
+          <w:b/>
+          <w:color w:val="000000" w:themeColor="text1"/>
+          <w:lang w:val="en-US"/>
+        </w:rPr>
+        <w:t xml:space="preserve">create </w:t>
+      </w:r>
+      <w:proofErr w:type="spellStart"/>
+      <w:proofErr w:type="gramStart"/>
+      <w:r>
+        <w:rPr>
+          <w:b/>
+          <w:color w:val="000000" w:themeColor="text1"/>
+          <w:lang w:val="en-US"/>
+        </w:rPr>
+        <w:t>sonar.project</w:t>
+      </w:r>
+      <w:proofErr w:type="gramEnd"/>
+      <w:r>
+        <w:rPr>
+          <w:b/>
+          <w:color w:val="000000" w:themeColor="text1"/>
+          <w:lang w:val="en-US"/>
+        </w:rPr>
+        <w:t>.properties</w:t>
+      </w:r>
+      <w:proofErr w:type="spellEnd"/>
+      <w:r>
+        <w:rPr>
+          <w:b/>
+          <w:color w:val="000000" w:themeColor="text1"/>
+          <w:lang w:val="en-US"/>
+        </w:rPr>
+        <w:t xml:space="preserve"> in root folder</w:t>
+      </w:r>
+    </w:p>
+    <w:p>
+      <w:pPr>
+        <w:rPr>
+          <w:b/>
+          <w:color w:val="000000" w:themeColor="text1"/>
+          <w:lang w:val="en-US"/>
+        </w:rPr>
+      </w:pPr>
+    </w:p>
+    <w:p>
+      <w:pPr>
+        <w:shd w:val="clear" w:color="auto" w:fill="1F1F1F"/>
+        <w:spacing w:after="0" w:line="285" w:lineRule="atLeast"/>
+        <w:rPr>
+          <w:rFonts w:ascii="Consolas" w:eastAsia="Times New Roman" w:hAnsi="Consolas" w:cs="Times New Roman"/>
+          <w:color w:val="CCCCCC"/>
+          <w:sz w:val="21"/>
+          <w:szCs w:val="21"/>
+          <w:lang w:eastAsia="en-IN"/>
+        </w:rPr>
+      </w:pPr>
+    </w:p>
+    <w:p>
+      <w:pPr>
+        <w:shd w:val="clear" w:color="auto" w:fill="1F1F1F"/>
+        <w:spacing w:after="0" w:line="285" w:lineRule="atLeast"/>
+        <w:rPr>
+          <w:rFonts w:ascii="Consolas" w:eastAsia="Times New Roman" w:hAnsi="Consolas" w:cs="Times New Roman"/>
+          <w:color w:val="CCCCCC"/>
+          <w:sz w:val="21"/>
+          <w:szCs w:val="21"/>
+          <w:lang w:eastAsia="en-IN"/>
+        </w:rPr>
+      </w:pPr>
+      <w:r>
+        <w:rPr>
+          <w:rFonts w:ascii="Consolas" w:eastAsia="Times New Roman" w:hAnsi="Consolas" w:cs="Times New Roman"/>
+          <w:color w:val="6A9955"/>
+          <w:sz w:val="21"/>
+          <w:szCs w:val="21"/>
+          <w:lang w:eastAsia="en-IN"/>
+        </w:rPr>
+        <w:t>#for code coverage (xml file)</w:t>
+      </w:r>
+    </w:p>
+    <w:p>
+      <w:pPr>
+        <w:shd w:val="clear" w:color="auto" w:fill="1F1F1F"/>
+        <w:spacing w:after="0" w:line="285" w:lineRule="atLeast"/>
+        <w:rPr>
+          <w:rFonts w:ascii="Consolas" w:eastAsia="Times New Roman" w:hAnsi="Consolas" w:cs="Times New Roman"/>
+          <w:color w:val="CCCCCC"/>
+          <w:sz w:val="21"/>
+          <w:szCs w:val="21"/>
+          <w:lang w:eastAsia="en-IN"/>
+        </w:rPr>
+      </w:pPr>
+      <w:proofErr w:type="gramStart"/>
+      <w:r>
+        <w:rPr>
+          <w:rFonts w:ascii="Consolas" w:eastAsia="Times New Roman" w:hAnsi="Consolas" w:cs="Times New Roman"/>
+          <w:color w:val="569CD6"/>
+          <w:sz w:val="21"/>
+          <w:szCs w:val="21"/>
+          <w:lang w:eastAsia="en-IN"/>
+        </w:rPr>
+        <w:t>sonar.python</w:t>
+      </w:r>
+      <w:proofErr w:type="gramEnd"/>
+      <w:r>
+        <w:rPr>
+          <w:rFonts w:ascii="Consolas" w:eastAsia="Times New Roman" w:hAnsi="Consolas" w:cs="Times New Roman"/>
+          <w:color w:val="569CD6"/>
+          <w:sz w:val="21"/>
+          <w:szCs w:val="21"/>
+          <w:lang w:eastAsia="en-IN"/>
+        </w:rPr>
+        <w:t>.coverage.reportPaths</w:t>
+      </w:r>
+      <w:r>
+        <w:rPr>
+          <w:rFonts w:ascii="Consolas" w:eastAsia="Times New Roman" w:hAnsi="Consolas" w:cs="Times New Roman"/>
+          <w:color w:val="CCCCCC"/>
+          <w:sz w:val="21"/>
+          <w:szCs w:val="21"/>
+          <w:lang w:eastAsia="en-IN"/>
+        </w:rPr>
+        <w:t>=coverage.xml</w:t>
+      </w:r>
+    </w:p>
+    <w:p>
+      <w:pPr>
+        <w:shd w:val="clear" w:color="auto" w:fill="1F1F1F"/>
+        <w:spacing w:after="0" w:line="285" w:lineRule="atLeast"/>
+        <w:rPr>
+          <w:rFonts w:ascii="Consolas" w:eastAsia="Times New Roman" w:hAnsi="Consolas" w:cs="Times New Roman"/>
+          <w:color w:val="CCCCCC"/>
+          <w:sz w:val="21"/>
+          <w:szCs w:val="21"/>
+          <w:lang w:eastAsia="en-IN"/>
+        </w:rPr>
+      </w:pPr>
+      <w:proofErr w:type="spellStart"/>
+      <w:proofErr w:type="gramStart"/>
+      <w:r>
+        <w:rPr>
+          <w:rFonts w:ascii="Consolas" w:eastAsia="Times New Roman" w:hAnsi="Consolas" w:cs="Times New Roman"/>
+          <w:color w:val="569CD6"/>
+          <w:sz w:val="21"/>
+          <w:szCs w:val="21"/>
+          <w:lang w:eastAsia="en-IN"/>
+        </w:rPr>
+        <w:t>sonar.projectKey</w:t>
+      </w:r>
+      <w:proofErr w:type="spellEnd"/>
+      <w:proofErr w:type="gramEnd"/>
+      <w:r>
+        <w:rPr>
+          <w:rFonts w:ascii="Consolas" w:eastAsia="Times New Roman" w:hAnsi="Consolas" w:cs="Times New Roman"/>
+          <w:color w:val="CCCCCC"/>
+          <w:sz w:val="21"/>
+          <w:szCs w:val="21"/>
+          <w:lang w:eastAsia="en-IN"/>
+        </w:rPr>
+        <w:t>=</w:t>
+      </w:r>
+      <w:proofErr w:type="spellStart"/>
+      <w:r>
+        <w:rPr>
+          <w:rFonts w:ascii="Consolas" w:eastAsia="Times New Roman" w:hAnsi="Consolas" w:cs="Times New Roman"/>
+          <w:color w:val="CCCCCC"/>
+          <w:sz w:val="21"/>
+          <w:szCs w:val="21"/>
+          <w:lang w:eastAsia="en-IN"/>
+        </w:rPr>
+        <w:t>nikunj_sonar_key</w:t>
+      </w:r>
+      <w:proofErr w:type="spellEnd"/>
+    </w:p>
+    <w:p>
+      <w:pPr>
+        <w:shd w:val="clear" w:color="auto" w:fill="1F1F1F"/>
+        <w:spacing w:after="0" w:line="285" w:lineRule="atLeast"/>
+        <w:rPr>
+          <w:rFonts w:ascii="Consolas" w:eastAsia="Times New Roman" w:hAnsi="Consolas" w:cs="Times New Roman"/>
+          <w:color w:val="CCCCCC"/>
+          <w:sz w:val="21"/>
+          <w:szCs w:val="21"/>
+          <w:lang w:eastAsia="en-IN"/>
+        </w:rPr>
+      </w:pPr>
+      <w:r>
+        <w:rPr>
+          <w:rFonts w:ascii="Consolas" w:eastAsia="Times New Roman" w:hAnsi="Consolas" w:cs="Times New Roman"/>
+          <w:color w:val="6A9955"/>
+          <w:sz w:val="21"/>
+          <w:szCs w:val="21"/>
+          <w:lang w:eastAsia="en-IN"/>
+        </w:rPr>
+        <w:t>#</w:t>
+      </w:r>
+      <w:proofErr w:type="spellStart"/>
+      <w:r>
+        <w:rPr>
+          <w:rFonts w:ascii="Consolas" w:eastAsia="Times New Roman" w:hAnsi="Consolas" w:cs="Times New Roman"/>
+          <w:color w:val="6A9955"/>
+          <w:sz w:val="21"/>
+          <w:szCs w:val="21"/>
+          <w:lang w:eastAsia="en-IN"/>
+        </w:rPr>
+        <w:t>sonarcube</w:t>
+      </w:r>
+      <w:proofErr w:type="spellEnd"/>
+      <w:r>
+        <w:rPr>
+          <w:rFonts w:ascii="Consolas" w:eastAsia="Times New Roman" w:hAnsi="Consolas" w:cs="Times New Roman"/>
+          <w:color w:val="6A9955"/>
+          <w:sz w:val="21"/>
+          <w:szCs w:val="21"/>
+          <w:lang w:eastAsia="en-IN"/>
+        </w:rPr>
+        <w:t xml:space="preserve"> server details</w:t>
+      </w:r>
+    </w:p>
+    <w:p>
+      <w:pPr>
+        <w:shd w:val="clear" w:color="auto" w:fill="1F1F1F"/>
+        <w:spacing w:after="0" w:line="285" w:lineRule="atLeast"/>
+        <w:rPr>
+          <w:rFonts w:ascii="Consolas" w:eastAsia="Times New Roman" w:hAnsi="Consolas" w:cs="Times New Roman"/>
+          <w:color w:val="CCCCCC"/>
+          <w:sz w:val="21"/>
+          <w:szCs w:val="21"/>
+          <w:lang w:eastAsia="en-IN"/>
+        </w:rPr>
+      </w:pPr>
+      <w:r>
+        <w:rPr>
+          <w:rFonts w:ascii="Consolas" w:eastAsia="Times New Roman" w:hAnsi="Consolas" w:cs="Times New Roman"/>
+          <w:color w:val="569CD6"/>
+          <w:sz w:val="21"/>
+          <w:szCs w:val="21"/>
+          <w:lang w:eastAsia="en-IN"/>
+        </w:rPr>
+        <w:t>sonar.host.url</w:t>
+      </w:r>
+      <w:r>
+        <w:rPr>
+          <w:rFonts w:ascii="Consolas" w:eastAsia="Times New Roman" w:hAnsi="Consolas" w:cs="Times New Roman"/>
+          <w:color w:val="CCCCCC"/>
+          <w:sz w:val="21"/>
+          <w:szCs w:val="21"/>
+          <w:lang w:eastAsia="en-IN"/>
+        </w:rPr>
+        <w:t>= http://localhost:9000</w:t>
+      </w:r>
+    </w:p>
+    <w:p>
+      <w:pPr>
+        <w:shd w:val="clear" w:color="auto" w:fill="1F1F1F"/>
+        <w:spacing w:after="0" w:line="285" w:lineRule="atLeast"/>
+        <w:rPr>
+          <w:rFonts w:ascii="Consolas" w:eastAsia="Times New Roman" w:hAnsi="Consolas" w:cs="Times New Roman"/>
+          <w:color w:val="CCCCCC"/>
+          <w:sz w:val="21"/>
+          <w:szCs w:val="21"/>
+          <w:lang w:eastAsia="en-IN"/>
+        </w:rPr>
+      </w:pPr>
+      <w:proofErr w:type="gramStart"/>
+      <w:r>
+        <w:rPr>
+          <w:rFonts w:ascii="Consolas" w:eastAsia="Times New Roman" w:hAnsi="Consolas" w:cs="Times New Roman"/>
+          <w:color w:val="569CD6"/>
+          <w:sz w:val="21"/>
+          <w:szCs w:val="21"/>
+          <w:lang w:eastAsia="en-IN"/>
+        </w:rPr>
+        <w:t>sonar.token</w:t>
+      </w:r>
+      <w:proofErr w:type="gramEnd"/>
+      <w:r>
+        <w:rPr>
+          <w:rFonts w:ascii="Consolas" w:eastAsia="Times New Roman" w:hAnsi="Consolas" w:cs="Times New Roman"/>
+          <w:color w:val="CCCCCC"/>
+          <w:sz w:val="21"/>
+          <w:szCs w:val="21"/>
+          <w:lang w:eastAsia="en-IN"/>
+        </w:rPr>
+        <w:t>=sqa_4fac42dea7a84ee166deb5e534026db909e7bf1d</w:t>
+      </w:r>
+    </w:p>
+    <w:p>
+      <w:pPr>
+        <w:rPr>
+          <w:b/>
+          <w:color w:val="000000" w:themeColor="text1"/>
+          <w:lang w:val="en-US"/>
+        </w:rPr>
+      </w:pPr>
+    </w:p>
+    <w:p>
+      <w:pPr>
+        <w:rPr>
+          <w:b/>
+          <w:color w:val="000000" w:themeColor="text1"/>
+          <w:lang w:val="en-US"/>
+        </w:rPr>
+      </w:pPr>
+    </w:p>
+    <w:p>
+      <w:pPr>
+        <w:rPr>
+          <w:b/>
+          <w:color w:val="000000" w:themeColor="text1"/>
+          <w:lang w:val="en-US"/>
+        </w:rPr>
+      </w:pPr>
+      <w:r>
+        <w:rPr>
+          <w:b/>
+          <w:color w:val="000000" w:themeColor="text1"/>
+          <w:lang w:val="en-US"/>
+        </w:rPr>
+        <w:t>create requrenments.txt &gt; add the below line</w:t>
+      </w:r>
+    </w:p>
+    <w:p>
+      <w:pPr>
+        <w:rPr>
+          <w:b/>
+          <w:color w:val="000000" w:themeColor="text1"/>
+          <w:lang w:val="en-US"/>
+        </w:rPr>
+      </w:pPr>
+      <w:proofErr w:type="spellStart"/>
+      <w:r>
+        <w:rPr>
+          <w:b/>
+          <w:color w:val="000000" w:themeColor="text1"/>
+          <w:lang w:val="en-US"/>
+        </w:rPr>
+        <w:t>pytest</w:t>
+      </w:r>
+      <w:proofErr w:type="spellEnd"/>
+    </w:p>
+    <w:p>
+      <w:pPr>
+        <w:pStyle w:val="ListParagraph"/>
+        <w:numPr>
+          <w:ilvl w:val="0"/>
+          <w:numId w:val="2"/>
+        </w:numPr>
+        <w:rPr>
+          <w:b/>
+          <w:color w:val="000000" w:themeColor="text1"/>
+          <w:lang w:val="en-US"/>
+        </w:rPr>
+      </w:pPr>
+      <w:r>
+        <w:rPr>
+          <w:b/>
+          <w:color w:val="000000" w:themeColor="text1"/>
+          <w:lang w:val="en-US"/>
+        </w:rPr>
+        <w:t>Move to the project folder</w:t>
+      </w:r>
+    </w:p>
+    <w:p>
+      <w:pPr>
+        <w:pStyle w:val="ListParagraph"/>
+        <w:numPr>
+          <w:ilvl w:val="0"/>
+          <w:numId w:val="2"/>
+        </w:numPr>
+        <w:rPr>
+          <w:b/>
+          <w:color w:val="000000" w:themeColor="text1"/>
+          <w:lang w:val="en-US"/>
+        </w:rPr>
+      </w:pPr>
+      <w:r>
+        <w:rPr>
+          <w:b/>
+          <w:color w:val="000000" w:themeColor="text1"/>
+          <w:lang w:val="en-US"/>
+        </w:rPr>
+        <w:t>pip install –r requirenments.txt</w:t>
+      </w:r>
+    </w:p>
+    <w:p>
+      <w:pPr>
+        <w:pStyle w:val="ListParagraph"/>
+        <w:numPr>
+          <w:ilvl w:val="0"/>
+          <w:numId w:val="2"/>
+        </w:numPr>
+        <w:rPr>
+          <w:b/>
+          <w:color w:val="000000" w:themeColor="text1"/>
+          <w:lang w:val="en-US"/>
+        </w:rPr>
+      </w:pPr>
+      <w:r>
+        <w:rPr>
+          <w:b/>
+          <w:color w:val="000000" w:themeColor="text1"/>
+          <w:lang w:val="en-US"/>
+        </w:rPr>
+        <w:t xml:space="preserve">coverage run –m </w:t>
+      </w:r>
+      <w:proofErr w:type="spellStart"/>
+      <w:r>
+        <w:rPr>
+          <w:b/>
+          <w:color w:val="000000" w:themeColor="text1"/>
+          <w:lang w:val="en-US"/>
+        </w:rPr>
+        <w:t>pytest</w:t>
+      </w:r>
+      <w:proofErr w:type="spellEnd"/>
+    </w:p>
+    <w:p>
+      <w:pPr>
+        <w:pStyle w:val="ListParagraph"/>
+        <w:numPr>
+          <w:ilvl w:val="0"/>
+          <w:numId w:val="2"/>
+        </w:numPr>
+        <w:rPr>
+          <w:b/>
+          <w:color w:val="000000" w:themeColor="text1"/>
+          <w:lang w:val="en-US"/>
+        </w:rPr>
+      </w:pPr>
+      <w:r>
+        <w:rPr>
+          <w:b/>
+          <w:color w:val="000000" w:themeColor="text1"/>
+          <w:lang w:val="en-US"/>
+        </w:rPr>
+        <w:t>coverage xml</w:t>
+      </w:r>
+    </w:p>
+    <w:p>
+      <w:pPr>
+        <w:rPr>
+          <w:b/>
+          <w:color w:val="000000" w:themeColor="text1"/>
+          <w:lang w:val="en-US"/>
+        </w:rPr>
+      </w:pPr>
+      <w:proofErr w:type="gramStart"/>
+      <w:r>
+        <w:rPr>
+          <w:b/>
+          <w:color w:val="000000" w:themeColor="text1"/>
+          <w:lang w:val="en-US"/>
+        </w:rPr>
+        <w:t>finally</w:t>
+      </w:r>
+      <w:proofErr w:type="gramEnd"/>
+      <w:r>
+        <w:rPr>
+          <w:b/>
+          <w:color w:val="000000" w:themeColor="text1"/>
+          <w:lang w:val="en-US"/>
+        </w:rPr>
+        <w:t xml:space="preserve"> Run</w:t>
+      </w:r>
+    </w:p>
+    <w:p>
+      <w:pPr>
+        <w:pStyle w:val="ListParagraph"/>
+        <w:numPr>
+          <w:ilvl w:val="0"/>
+          <w:numId w:val="2"/>
+        </w:numPr>
+        <w:rPr>
+          <w:b/>
+          <w:color w:val="000000" w:themeColor="text1"/>
+          <w:lang w:val="en-US"/>
+        </w:rPr>
+      </w:pPr>
+      <w:r>
+        <w:rPr>
+          <w:b/>
+          <w:color w:val="000000" w:themeColor="text1"/>
+          <w:lang w:val="en-US"/>
+        </w:rPr>
+        <w:t>sonar-scanner</w:t>
+      </w:r>
+    </w:p>
+    <w:p>
+      <w:pPr>
+        <w:pStyle w:val="ListParagraph"/>
+        <w:ind w:left="1080"/>
+        <w:rPr>
+          <w:b/>
+          <w:color w:val="000000" w:themeColor="text1"/>
+          <w:lang w:val="en-US"/>
+        </w:rPr>
+      </w:pPr>
+    </w:p>
+    <w:p>
+      <w:pPr>
+        <w:pStyle w:val="ListParagraph"/>
+        <w:ind w:left="1080"/>
+        <w:rPr>
+          <w:b/>
+          <w:color w:val="000000" w:themeColor="text1"/>
+          <w:lang w:val="en-US"/>
+        </w:rPr>
+      </w:pPr>
+      <w:r>
+        <w:rPr>
+          <w:b/>
+          <w:color w:val="000000" w:themeColor="text1"/>
+          <w:lang w:val="en-US"/>
+        </w:rPr>
+        <w:lastRenderedPageBreak/>
+        <w:t>on the cli you will see success message</w:t>
+      </w:r>
+    </w:p>
+    <w:p>
+      <w:pPr>
+        <w:pStyle w:val="ListParagraph"/>
+        <w:ind w:left="1080"/>
+        <w:rPr>
+          <w:b/>
+          <w:color w:val="000000" w:themeColor="text1"/>
+          <w:lang w:val="en-US"/>
+        </w:rPr>
+      </w:pPr>
+    </w:p>
+    <w:p>
+      <w:pPr>
+        <w:pStyle w:val="ListParagraph"/>
+        <w:ind w:left="1080"/>
+        <w:rPr>
+          <w:b/>
+          <w:color w:val="000000" w:themeColor="text1"/>
+          <w:lang w:val="en-US"/>
+        </w:rPr>
+      </w:pPr>
+      <w:r>
+        <w:rPr>
+          <w:noProof/>
+          <w:lang w:eastAsia="en-IN"/>
+        </w:rPr>
+        <w:drawing>
+          <wp:inline distT="0" distB="0" distL="0" distR="0" wp14:anchorId="7B0A1868" wp14:editId="576B67C3">
+            <wp:extent cx="5436734" cy="1247775"/>
+            <wp:effectExtent l="0" t="0" r="0" b="0"/>
+            <wp:docPr id="17" name="Picture 17"/>
+            <wp:cNvGraphicFramePr>
+              <a:graphicFrameLocks xmlns:a="http://schemas.openxmlformats.org/drawingml/2006/main" noChangeAspect="1"/>
+            </wp:cNvGraphicFramePr>
+            <a:graphic xmlns:a="http://schemas.openxmlformats.org/drawingml/2006/main">
+              <a:graphicData uri="http://schemas.openxmlformats.org/drawingml/2006/picture">
+                <pic:pic xmlns:pic="http://schemas.openxmlformats.org/drawingml/2006/picture">
+                  <pic:nvPicPr>
+                    <pic:cNvPr id="1" name=""/>
+                    <pic:cNvPicPr/>
+                  </pic:nvPicPr>
+                  <pic:blipFill rotWithShape="1">
+                    <a:blip r:embed="rId20"/>
+                    <a:srcRect l="27255" t="62364" r="1784" b="8670"/>
+                    <a:stretch/>
+                  </pic:blipFill>
+                  <pic:spPr bwMode="auto">
+                    <a:xfrm>
+                      <a:off x="0" y="0"/>
+                      <a:ext cx="5443690" cy="1249371"/>
+                    </a:xfrm>
+                    <a:prstGeom prst="rect">
+                      <a:avLst/>
+                    </a:prstGeom>
+                    <a:ln>
+                      <a:noFill/>
+                    </a:ln>
+                    <a:extLst>
+                      <a:ext uri="{53640926-AAD7-44D8-BBD7-CCE9431645EC}">
+                        <a14:shadowObscured xmlns:a14="http://schemas.microsoft.com/office/drawing/2010/main"/>
+                      </a:ext>
+                    </a:extLst>
+                  </pic:spPr>
+                </pic:pic>
+              </a:graphicData>
+            </a:graphic>
+          </wp:inline>
+        </w:drawing>
+      </w:r>
+    </w:p>
+    <w:p>
+      <w:pPr>
+        <w:pStyle w:val="ListParagraph"/>
+        <w:ind w:left="1080"/>
+        <w:rPr>
+          <w:b/>
+          <w:color w:val="000000" w:themeColor="text1"/>
+          <w:lang w:val="en-US"/>
+        </w:rPr>
+      </w:pPr>
+    </w:p>
+    <w:p>
+      <w:pPr>
+        <w:pStyle w:val="ListParagraph"/>
+        <w:numPr>
+          <w:ilvl w:val="0"/>
+          <w:numId w:val="2"/>
+        </w:numPr>
+        <w:rPr>
+          <w:b/>
+          <w:color w:val="000000" w:themeColor="text1"/>
+          <w:lang w:val="en-US"/>
+        </w:rPr>
+      </w:pPr>
+      <w:proofErr w:type="spellStart"/>
+      <w:r>
+        <w:rPr>
+          <w:b/>
+          <w:color w:val="000000" w:themeColor="text1"/>
+          <w:lang w:val="en-US"/>
+        </w:rPr>
+        <w:t>goto</w:t>
+      </w:r>
+      <w:proofErr w:type="spellEnd"/>
+      <w:r>
+        <w:rPr>
+          <w:b/>
+          <w:color w:val="000000" w:themeColor="text1"/>
+          <w:lang w:val="en-US"/>
+        </w:rPr>
+        <w:t xml:space="preserve"> &gt; browser&gt; localhost:9000</w:t>
+      </w:r>
+    </w:p>
+    <w:p>
+      <w:pPr>
+        <w:pStyle w:val="ListParagraph"/>
+        <w:numPr>
+          <w:ilvl w:val="0"/>
+          <w:numId w:val="2"/>
+        </w:numPr>
+        <w:rPr>
+          <w:b/>
+          <w:color w:val="000000" w:themeColor="text1"/>
+          <w:lang w:val="en-US"/>
+        </w:rPr>
+      </w:pPr>
+      <w:r>
+        <w:rPr>
+          <w:b/>
+          <w:color w:val="000000" w:themeColor="text1"/>
+          <w:lang w:val="en-US"/>
+        </w:rPr>
+        <w:t>click on projects</w:t>
+      </w:r>
+    </w:p>
+    <w:p>
+      <w:pPr>
+        <w:pStyle w:val="ListParagraph"/>
+        <w:ind w:left="1080"/>
+        <w:rPr>
+          <w:b/>
+          <w:color w:val="000000" w:themeColor="text1"/>
+          <w:lang w:val="en-US"/>
+        </w:rPr>
+      </w:pPr>
+      <w:r>
+        <w:rPr>
+          <w:b/>
+          <w:color w:val="000000" w:themeColor="text1"/>
+          <w:lang w:val="en-US"/>
+        </w:rPr>
+        <w:t>you will see the new project will be created automatically by vs code</w:t>
+      </w:r>
+    </w:p>
+    <w:p>
+      <w:pPr>
+        <w:pStyle w:val="ListParagraph"/>
+        <w:ind w:left="1080"/>
+        <w:rPr>
+          <w:b/>
+          <w:color w:val="000000" w:themeColor="text1"/>
+          <w:lang w:val="en-US"/>
+        </w:rPr>
+      </w:pPr>
+    </w:p>
+    <w:p>
+      <w:pPr>
+        <w:pStyle w:val="ListParagraph"/>
+        <w:ind w:left="1080"/>
+        <w:rPr>
+          <w:b/>
+          <w:color w:val="000000" w:themeColor="text1"/>
+          <w:lang w:val="en-US"/>
+        </w:rPr>
+      </w:pPr>
+    </w:p>
+    <w:p>
+      <w:pPr>
+        <w:rPr>
+          <w:b/>
+          <w:color w:val="000000" w:themeColor="text1"/>
+          <w:lang w:val="en-US"/>
+        </w:rPr>
+      </w:pPr>
+      <w:r>
+        <w:rPr>
+          <w:noProof/>
+          <w:lang w:eastAsia="en-IN"/>
+        </w:rPr>
+        <w:drawing>
+          <wp:inline distT="0" distB="0" distL="0" distR="0" wp14:anchorId="24D10B7E" wp14:editId="4A5522CD">
+            <wp:extent cx="5741035" cy="2609850"/>
+            <wp:effectExtent l="0" t="0" r="0" b="0"/>
+            <wp:docPr id="18" name="Picture 18"/>
+            <wp:cNvGraphicFramePr>
+              <a:graphicFrameLocks xmlns:a="http://schemas.openxmlformats.org/drawingml/2006/main" noChangeAspect="1"/>
+            </wp:cNvGraphicFramePr>
+            <a:graphic xmlns:a="http://schemas.openxmlformats.org/drawingml/2006/main">
+              <a:graphicData uri="http://schemas.openxmlformats.org/drawingml/2006/picture">
+                <pic:pic xmlns:pic="http://schemas.openxmlformats.org/drawingml/2006/picture">
+                  <pic:nvPicPr>
+                    <pic:cNvPr id="1" name=""/>
+                    <pic:cNvPicPr/>
+                  </pic:nvPicPr>
+                  <pic:blipFill rotWithShape="1">
+                    <a:blip r:embed="rId21"/>
+                    <a:srcRect l="-166" t="11526" b="7488"/>
+                    <a:stretch/>
+                  </pic:blipFill>
+                  <pic:spPr bwMode="auto">
+                    <a:xfrm>
+                      <a:off x="0" y="0"/>
+                      <a:ext cx="5741035" cy="2609850"/>
+                    </a:xfrm>
+                    <a:prstGeom prst="rect">
+                      <a:avLst/>
+                    </a:prstGeom>
+                    <a:ln>
+                      <a:noFill/>
+                    </a:ln>
+                    <a:extLst>
+                      <a:ext uri="{53640926-AAD7-44D8-BBD7-CCE9431645EC}">
+                        <a14:shadowObscured xmlns:a14="http://schemas.microsoft.com/office/drawing/2010/main"/>
+                      </a:ext>
+                    </a:extLst>
+                  </pic:spPr>
+                </pic:pic>
+              </a:graphicData>
+            </a:graphic>
+          </wp:inline>
+        </w:drawing>
+      </w:r>
+      <w:bookmarkStart w:id="0" w:name="_GoBack"/>
       <w:bookmarkEnd w:id="0"/>
-    </w:p>
-    <w:p>
-      <w:pPr>
-        <w:rPr>
-          <w:b/>
-          <w:color w:val="000000" w:themeColor="text1"/>
-          <w:lang w:val="en-US"/>
-        </w:rPr>
-      </w:pPr>
     </w:p>
     <w:sectPr>
       <w:pgSz w:w="11906" w:h="16838"/>
@@ -1722,6 +5083,28 @@
       <w:szCs w:val="26"/>
     </w:rPr>
   </w:style>
+  <w:style w:type="paragraph" w:styleId="Heading3">
+    <w:name w:val="heading 3"/>
+    <w:basedOn w:val="Normal"/>
+    <w:next w:val="Normal"/>
+    <w:link w:val="Heading3Char"/>
+    <w:uiPriority w:val="9"/>
+    <w:unhideWhenUsed/>
+    <w:qFormat/>
+    <w:rsid w:val="00346E62"/>
+    <w:pPr>
+      <w:keepNext/>
+      <w:keepLines/>
+      <w:spacing w:before="40" w:after="0"/>
+      <w:outlineLvl w:val="2"/>
+    </w:pPr>
+    <w:rPr>
+      <w:rFonts w:asciiTheme="majorHAnsi" w:eastAsiaTheme="majorEastAsia" w:hAnsiTheme="majorHAnsi" w:cstheme="majorBidi"/>
+      <w:color w:val="1F4D78" w:themeColor="accent1" w:themeShade="7F"/>
+      <w:sz w:val="24"/>
+      <w:szCs w:val="24"/>
+    </w:rPr>
+  </w:style>
   <w:style w:type="character" w:default="1" w:styleId="DefaultParagraphFont">
     <w:name w:val="Default Paragraph Font"/>
     <w:uiPriority w:val="1"/>
@@ -1796,6 +5179,19 @@
       <w:ind w:left="720"/>
       <w:contextualSpacing/>
     </w:pPr>
+  </w:style>
+  <w:style w:type="character" w:customStyle="1" w:styleId="Heading3Char">
+    <w:name w:val="Heading 3 Char"/>
+    <w:basedOn w:val="DefaultParagraphFont"/>
+    <w:link w:val="Heading3"/>
+    <w:uiPriority w:val="9"/>
+    <w:rsid w:val="00346E62"/>
+    <w:rPr>
+      <w:rFonts w:asciiTheme="majorHAnsi" w:eastAsiaTheme="majorEastAsia" w:hAnsiTheme="majorHAnsi" w:cstheme="majorBidi"/>
+      <w:color w:val="1F4D78" w:themeColor="accent1" w:themeShade="7F"/>
+      <w:sz w:val="24"/>
+      <w:szCs w:val="24"/>
+    </w:rPr>
   </w:style>
 </w:styles>
 </file>

</xml_diff>